<commit_message>
Add cover as the first book page
</commit_message>
<xml_diff>
--- a/POETRY/Limericks and Nonsense Rhymes/Limericks_and_Other_Rhymes_for_People_Who_Should_Know_Better_REV02.docx
+++ b/POETRY/Limericks and Nonsense Rhymes/Limericks_and_Other_Rhymes_for_People_Who_Should_Know_Better_REV02.docx
@@ -35,21 +35,108 @@
         <w:t xml:space="preserve">Seamus O'Leary</w:t>
       </w:r>
     </w:p>
-    <w:bookmarkStart w:id="245" w:name="X00693da8d63ee7683df0f17f241e16a3eb08d21"/>
-    <w:p>
-      <w:pPr>
-        <w:pStyle w:val="Heading1"/>
-      </w:pPr>
-      <w:r>
-        <w:rPr>
-          <w:lang w:val="en-US"/>
-        </w:rPr>
-        <w:t xml:space="preserve">Limericks and Other Rhymes for People Who Should Know Better (Illustrated)</w:t>
-      </w:r>
-    </w:p>
     <w:p>
       <w:pPr>
         <w:pStyle w:val="FirstParagraph"/>
+      </w:pPr>
+      <w:r>
+        <w:drawing>
+          <wp:inline>
+            <wp:extent cx="2560320" cy="4093414"/>
+            <wp:effectExtent b="0" l="0" r="0" t="0"/>
+            <wp:docPr descr="Cover: Limericks and Other Rhymes for People Who Should Know Better" title="" id="10" name="Picture"/>
+            <a:graphic>
+              <a:graphicData uri="http://schemas.openxmlformats.org/drawingml/2006/picture">
+                <pic:pic>
+                  <pic:nvPicPr>
+                    <pic:cNvPr descr="images/cover.png" id="11" name="Picture"/>
+                    <pic:cNvPicPr>
+                      <a:picLocks noChangeArrowheads="1" noChangeAspect="1"/>
+                    </pic:cNvPicPr>
+                  </pic:nvPicPr>
+                  <pic:blipFill>
+                    <a:blip r:embed="rId9"/>
+                    <a:stretch>
+                      <a:fillRect/>
+                    </a:stretch>
+                  </pic:blipFill>
+                  <pic:spPr bwMode="auto">
+                    <a:xfrm>
+                      <a:off x="0" y="0"/>
+                      <a:ext cx="2560320" cy="4093414"/>
+                    </a:xfrm>
+                    <a:prstGeom prst="rect">
+                      <a:avLst/>
+                    </a:prstGeom>
+                    <a:noFill/>
+                    <a:ln w="9525">
+                      <a:noFill/>
+                      <a:headEnd/>
+                      <a:tailEnd/>
+                    </a:ln>
+                  </pic:spPr>
+                </pic:pic>
+              </a:graphicData>
+            </a:graphic>
+          </wp:inline>
+        </w:drawing>
+      </w:r>
+      <w:r>
+        <w:rPr>
+          <w:rStyle w:val="VerbatimChar"/>
+          <w:lang w:val="en-US"/>
+        </w:rPr>
+        <w:t xml:space="preserve">r</w:t>
+      </w:r>
+      <w:r>
+        <w:rPr>
+          <w:lang w:val="en-US"/>
+        </w:rPr>
+        <w:t xml:space="preserve">n</w:t>
+      </w:r>
+      <w:r>
+        <w:rPr>
+          <w:rStyle w:val="VerbatimChar"/>
+          <w:lang w:val="en-US"/>
+        </w:rPr>
+        <w:t xml:space="preserve">r</w:t>
+      </w:r>
+      <w:r>
+        <w:rPr>
+          <w:lang w:val="en-US"/>
+        </w:rPr>
+        <w:t xml:space="preserve">n</w:t>
+      </w:r>
+      <w:r>
+        <w:rPr>
+          <w:rStyle w:val="VerbatimChar"/>
+          <w:lang w:val="en-US"/>
+        </w:rPr>
+        <w:t xml:space="preserve">r</w:t>
+      </w:r>
+      <w:r>
+        <w:rPr>
+          <w:lang w:val="en-US"/>
+        </w:rPr>
+        <w:t xml:space="preserve">n</w:t>
+      </w:r>
+      <w:r>
+        <w:rPr>
+          <w:rStyle w:val="VerbatimChar"/>
+          <w:lang w:val="en-US"/>
+        </w:rPr>
+        <w:t xml:space="preserve">r</w:t>
+      </w:r>
+      <w:r>
+        <w:rPr>
+          <w:lang w:val="en-US"/>
+        </w:rPr>
+        <w:t xml:space="preserve">n# Limericks and Other Rhymes for People Who Should Know Better (Illustrated)</w:t>
+      </w:r>
+    </w:p>
+    <w:p>
+      <w:pPr>
+        <w:pStyle w:val="BodyText"/>
       </w:pPr>
       <w:r>
         <w:rPr>
@@ -69,7 +156,7 @@
         <w:t xml:space="preserve">Seamus O’Leary</w:t>
       </w:r>
     </w:p>
-    <w:bookmarkStart w:id="9" w:name="copyright"/>
+    <w:bookmarkStart w:id="12" w:name="copyright"/>
     <w:p>
       <w:pPr>
         <w:pStyle w:val="Heading2"/>
@@ -103,8 +190,8 @@
         <w:t xml:space="preserve">All rights reserved for this edition’s new selection, arrangement, editorial material, and human-edited modern poems. The nineteenth-century poems are public-domain texts. AI-generated text and illustrations are identified in the notes.</w:t>
       </w:r>
     </w:p>
-    <w:bookmarkEnd w:id="9"/>
-    <w:bookmarkStart w:id="10" w:name="editors-note"/>
+    <w:bookmarkEnd w:id="12"/>
+    <w:bookmarkStart w:id="13" w:name="editors-note"/>
     <w:p>
       <w:pPr>
         <w:pStyle w:val="Heading2"/>
@@ -184,8 +271,8 @@
         <w:t xml:space="preserve">. Early printings and later editions contain textual variants; this anthology preserves a readable selection and spelling. Sources are listed at the end.</w:t>
       </w:r>
     </w:p>
-    <w:bookmarkEnd w:id="10"/>
-    <w:bookmarkStart w:id="11" w:name="contents"/>
+    <w:bookmarkEnd w:id="13"/>
+    <w:bookmarkStart w:id="14" w:name="contents"/>
     <w:p>
       <w:pPr>
         <w:pStyle w:val="Heading2"/>
@@ -527,8 +614,8 @@
         </w:r>
       </w:hyperlink>
     </w:p>
-    <w:bookmarkEnd w:id="11"/>
-    <w:bookmarkStart w:id="52" w:name="animals-birds-beasts"/>
+    <w:bookmarkEnd w:id="14"/>
+    <w:bookmarkStart w:id="55" w:name="animals-birds-beasts"/>
     <w:p>
       <w:pPr>
         <w:pStyle w:val="Heading2"/>
@@ -549,18 +636,18 @@
           <wp:inline>
             <wp:extent cx="2743200" cy="4114799"/>
             <wp:effectExtent b="0" l="0" r="0" t="0"/>
-            <wp:docPr descr="An old gentleman discovers a flock nesting in his beard." title="" id="13" name="Picture"/>
+            <wp:docPr descr="An old gentleman discovers a flock nesting in his beard." title="" id="16" name="Picture"/>
             <a:graphic>
               <a:graphicData uri="http://schemas.openxmlformats.org/drawingml/2006/picture">
                 <pic:pic>
                   <pic:nvPicPr>
-                    <pic:cNvPr descr="images/01_birds_in_the_beard.jpg" id="14" name="Picture"/>
+                    <pic:cNvPr descr="images/01_birds_in_the_beard.jpg" id="17" name="Picture"/>
                     <pic:cNvPicPr>
                       <a:picLocks noChangeArrowheads="1" noChangeAspect="1"/>
                     </pic:cNvPicPr>
                   </pic:nvPicPr>
                   <pic:blipFill>
-                    <a:blip r:embed="rId12"/>
+                    <a:blip r:embed="rId15"/>
                     <a:stretch>
                       <a:fillRect/>
                     </a:stretch>
@@ -598,7 +685,7 @@
         <w:t xml:space="preserve">The beard becomes a birdhouse.</w:t>
       </w:r>
     </w:p>
-    <w:bookmarkStart w:id="15" w:name="section"/>
+    <w:bookmarkStart w:id="18" w:name="section"/>
     <w:p>
       <w:pPr>
         <w:pStyle w:val="Heading3"/>
@@ -648,8 +735,8 @@
         <w:t xml:space="preserve">Have all built their nests in my beard!”</w:t>
       </w:r>
     </w:p>
-    <w:bookmarkEnd w:id="15"/>
-    <w:bookmarkStart w:id="16" w:name="section-1"/>
+    <w:bookmarkEnd w:id="18"/>
+    <w:bookmarkStart w:id="19" w:name="section-1"/>
     <w:p>
       <w:pPr>
         <w:pStyle w:val="Heading3"/>
@@ -699,8 +786,8 @@
         <w:t xml:space="preserve">And frequently walked about Ryde.</w:t>
       </w:r>
     </w:p>
-    <w:bookmarkEnd w:id="16"/>
-    <w:bookmarkStart w:id="17" w:name="section-2"/>
+    <w:bookmarkEnd w:id="19"/>
+    <w:bookmarkStart w:id="20" w:name="section-2"/>
     <w:p>
       <w:pPr>
         <w:pStyle w:val="Heading3"/>
@@ -750,8 +837,8 @@
         <w:t xml:space="preserve">Are welcome to sit on my bonnet!”</w:t>
       </w:r>
     </w:p>
-    <w:bookmarkEnd w:id="17"/>
-    <w:bookmarkStart w:id="18" w:name="section-3"/>
+    <w:bookmarkEnd w:id="20"/>
+    <w:bookmarkStart w:id="21" w:name="section-3"/>
     <w:p>
       <w:pPr>
         <w:pStyle w:val="Heading3"/>
@@ -801,8 +888,8 @@
         <w:t xml:space="preserve">You incongruous Old Woman of Smyrna!”</w:t>
       </w:r>
     </w:p>
-    <w:bookmarkEnd w:id="18"/>
-    <w:bookmarkStart w:id="19" w:name="section-4"/>
+    <w:bookmarkEnd w:id="21"/>
+    <w:bookmarkStart w:id="22" w:name="section-4"/>
     <w:p>
       <w:pPr>
         <w:pStyle w:val="Heading3"/>
@@ -852,8 +939,8 @@
         <w:t xml:space="preserve">It’s a regular brute of a Bee.”</w:t>
       </w:r>
     </w:p>
-    <w:bookmarkEnd w:id="19"/>
-    <w:bookmarkStart w:id="20" w:name="section-5"/>
+    <w:bookmarkEnd w:id="22"/>
+    <w:bookmarkStart w:id="23" w:name="section-5"/>
     <w:p>
       <w:pPr>
         <w:pStyle w:val="Heading3"/>
@@ -903,8 +990,8 @@
         <w:t xml:space="preserve">That it killed that Old Man of Madras.</w:t>
       </w:r>
     </w:p>
-    <w:bookmarkEnd w:id="20"/>
-    <w:bookmarkStart w:id="21" w:name="section-6"/>
+    <w:bookmarkEnd w:id="23"/>
+    <w:bookmarkStart w:id="24" w:name="section-6"/>
     <w:p>
       <w:pPr>
         <w:pStyle w:val="Heading3"/>
@@ -954,8 +1041,8 @@
         <w:t xml:space="preserve">So he very soon went back to Dover.</w:t>
       </w:r>
     </w:p>
-    <w:bookmarkEnd w:id="21"/>
-    <w:bookmarkStart w:id="22" w:name="section-7"/>
+    <w:bookmarkEnd w:id="24"/>
+    <w:bookmarkStart w:id="25" w:name="section-7"/>
     <w:p>
       <w:pPr>
         <w:pStyle w:val="Heading3"/>
@@ -1005,8 +1092,8 @@
         <w:t xml:space="preserve">While that futile Old Gentleman dozed.</w:t>
       </w:r>
     </w:p>
-    <w:bookmarkEnd w:id="22"/>
-    <w:bookmarkStart w:id="23" w:name="section-8"/>
+    <w:bookmarkEnd w:id="25"/>
+    <w:bookmarkStart w:id="26" w:name="section-8"/>
     <w:p>
       <w:pPr>
         <w:pStyle w:val="Heading3"/>
@@ -1056,8 +1143,8 @@
         <w:t xml:space="preserve">And sent to their Pa at Marseilles.</w:t>
       </w:r>
     </w:p>
-    <w:bookmarkEnd w:id="23"/>
-    <w:bookmarkStart w:id="24" w:name="section-9"/>
+    <w:bookmarkEnd w:id="26"/>
+    <w:bookmarkStart w:id="27" w:name="section-9"/>
     <w:p>
       <w:pPr>
         <w:pStyle w:val="Heading3"/>
@@ -1107,8 +1194,8 @@
         <w:t xml:space="preserve">Which relieved that Old Man and his nose.</w:t>
       </w:r>
     </w:p>
-    <w:bookmarkEnd w:id="24"/>
-    <w:bookmarkStart w:id="25" w:name="section-10"/>
+    <w:bookmarkEnd w:id="27"/>
+    <w:bookmarkStart w:id="28" w:name="section-10"/>
     <w:p>
       <w:pPr>
         <w:pStyle w:val="Heading3"/>
@@ -1158,8 +1245,8 @@
         <w:t xml:space="preserve">You invidious Old Man of Aôsta?”</w:t>
       </w:r>
     </w:p>
-    <w:bookmarkEnd w:id="25"/>
-    <w:bookmarkStart w:id="26" w:name="section-11"/>
+    <w:bookmarkEnd w:id="28"/>
+    <w:bookmarkStart w:id="29" w:name="section-11"/>
     <w:p>
       <w:pPr>
         <w:pStyle w:val="Heading3"/>
@@ -1209,8 +1296,8 @@
         <w:t xml:space="preserve">Which refreshed that Old Man and his Owl.</w:t>
       </w:r>
     </w:p>
-    <w:bookmarkEnd w:id="26"/>
-    <w:bookmarkStart w:id="27" w:name="section-12"/>
+    <w:bookmarkEnd w:id="29"/>
+    <w:bookmarkStart w:id="30" w:name="section-12"/>
     <w:p>
       <w:pPr>
         <w:pStyle w:val="Heading3"/>
@@ -1260,8 +1347,8 @@
         <w:t xml:space="preserve">Which refreshed that Old Person of Ewell.</w:t>
       </w:r>
     </w:p>
-    <w:bookmarkEnd w:id="27"/>
-    <w:bookmarkStart w:id="28" w:name="section-13"/>
+    <w:bookmarkEnd w:id="30"/>
+    <w:bookmarkStart w:id="31" w:name="section-13"/>
     <w:p>
       <w:pPr>
         <w:pStyle w:val="Heading3"/>
@@ -1311,8 +1398,8 @@
         <w:t xml:space="preserve">That judicious young person of Bantry.</w:t>
       </w:r>
     </w:p>
-    <w:bookmarkEnd w:id="28"/>
-    <w:bookmarkStart w:id="29" w:name="section-14"/>
+    <w:bookmarkEnd w:id="31"/>
+    <w:bookmarkStart w:id="32" w:name="section-14"/>
     <w:p>
       <w:pPr>
         <w:pStyle w:val="Heading3"/>
@@ -1362,8 +1449,8 @@
         <w:t xml:space="preserve">Which soothed that old man of Dunrose.</w:t>
       </w:r>
     </w:p>
-    <w:bookmarkEnd w:id="29"/>
-    <w:bookmarkStart w:id="30" w:name="section-15"/>
+    <w:bookmarkEnd w:id="32"/>
+    <w:bookmarkStart w:id="33" w:name="section-15"/>
     <w:p>
       <w:pPr>
         <w:pStyle w:val="Heading3"/>
@@ -1413,8 +1500,8 @@
         <w:t xml:space="preserve">Followed after that person of Shields.</w:t>
       </w:r>
     </w:p>
-    <w:bookmarkEnd w:id="30"/>
-    <w:bookmarkStart w:id="31" w:name="section-16"/>
+    <w:bookmarkEnd w:id="33"/>
+    <w:bookmarkStart w:id="34" w:name="section-16"/>
     <w:p>
       <w:pPr>
         <w:pStyle w:val="Heading3"/>
@@ -1464,8 +1551,8 @@
         <w:t xml:space="preserve">“It is time to return to Dunluce.”</w:t>
       </w:r>
     </w:p>
-    <w:bookmarkEnd w:id="31"/>
-    <w:bookmarkStart w:id="32" w:name="section-17"/>
+    <w:bookmarkEnd w:id="34"/>
+    <w:bookmarkStart w:id="35" w:name="section-17"/>
     <w:p>
       <w:pPr>
         <w:pStyle w:val="Heading3"/>
@@ -1515,8 +1602,8 @@
         <w:t xml:space="preserve">For the fish in the depths of the Dargle.”</w:t>
       </w:r>
     </w:p>
-    <w:bookmarkEnd w:id="32"/>
-    <w:bookmarkStart w:id="33" w:name="section-18"/>
+    <w:bookmarkEnd w:id="35"/>
+    <w:bookmarkStart w:id="36" w:name="section-18"/>
     <w:p>
       <w:pPr>
         <w:pStyle w:val="Heading3"/>
@@ -1566,8 +1653,8 @@
         <w:t xml:space="preserve">You obsequious old person of Brill?”</w:t>
       </w:r>
     </w:p>
-    <w:bookmarkEnd w:id="33"/>
-    <w:bookmarkStart w:id="34" w:name="section-19"/>
+    <w:bookmarkEnd w:id="36"/>
+    <w:bookmarkStart w:id="37" w:name="section-19"/>
     <w:p>
       <w:pPr>
         <w:pStyle w:val="Heading3"/>
@@ -1617,8 +1704,8 @@
         <w:t xml:space="preserve">And oppressed that young lady in white.</w:t>
       </w:r>
     </w:p>
-    <w:bookmarkEnd w:id="34"/>
-    <w:bookmarkStart w:id="35" w:name="section-20"/>
+    <w:bookmarkEnd w:id="37"/>
+    <w:bookmarkStart w:id="38" w:name="section-20"/>
     <w:p>
       <w:pPr>
         <w:pStyle w:val="Heading3"/>
@@ -1668,8 +1755,8 @@
         <w:t xml:space="preserve">Which grieved that old lady of France.</w:t>
       </w:r>
     </w:p>
-    <w:bookmarkEnd w:id="35"/>
-    <w:bookmarkStart w:id="36" w:name="section-21"/>
+    <w:bookmarkEnd w:id="38"/>
+    <w:bookmarkStart w:id="39" w:name="section-21"/>
     <w:p>
       <w:pPr>
         <w:pStyle w:val="Heading3"/>
@@ -1719,8 +1806,8 @@
         <w:t xml:space="preserve">That amiable man of Dumbree.</w:t>
       </w:r>
     </w:p>
-    <w:bookmarkEnd w:id="36"/>
-    <w:bookmarkStart w:id="37" w:name="section-22"/>
+    <w:bookmarkEnd w:id="39"/>
+    <w:bookmarkStart w:id="40" w:name="section-22"/>
     <w:p>
       <w:pPr>
         <w:pStyle w:val="Heading3"/>
@@ -1770,8 +1857,8 @@
         <w:t xml:space="preserve">That depressing old person of Crowle.</w:t>
       </w:r>
     </w:p>
-    <w:bookmarkEnd w:id="37"/>
-    <w:bookmarkStart w:id="38" w:name="section-23"/>
+    <w:bookmarkEnd w:id="40"/>
+    <w:bookmarkStart w:id="41" w:name="section-23"/>
     <w:p>
       <w:pPr>
         <w:pStyle w:val="Heading3"/>
@@ -1821,8 +1908,8 @@
         <w:t xml:space="preserve">In the roads and the lanes of El Hums.</w:t>
       </w:r>
     </w:p>
-    <w:bookmarkEnd w:id="38"/>
-    <w:bookmarkStart w:id="39" w:name="section-24"/>
+    <w:bookmarkEnd w:id="41"/>
+    <w:bookmarkStart w:id="42" w:name="section-24"/>
     <w:p>
       <w:pPr>
         <w:pStyle w:val="Heading3"/>
@@ -1872,8 +1959,8 @@
         <w:t xml:space="preserve">That affable person of Nice!</w:t>
       </w:r>
     </w:p>
-    <w:bookmarkEnd w:id="39"/>
-    <w:bookmarkStart w:id="40" w:name="section-25"/>
+    <w:bookmarkEnd w:id="42"/>
+    <w:bookmarkStart w:id="43" w:name="section-25"/>
     <w:p>
       <w:pPr>
         <w:pStyle w:val="Heading3"/>
@@ -1923,8 +2010,8 @@
         <w:t xml:space="preserve">Which vexed all the folks on the Border.</w:t>
       </w:r>
     </w:p>
-    <w:bookmarkEnd w:id="40"/>
-    <w:bookmarkStart w:id="41" w:name="section-26"/>
+    <w:bookmarkEnd w:id="43"/>
+    <w:bookmarkStart w:id="44" w:name="section-26"/>
     <w:p>
       <w:pPr>
         <w:pStyle w:val="Heading3"/>
@@ -1974,8 +2061,8 @@
         <w:t xml:space="preserve">That anxious old man of Ancona.</w:t>
       </w:r>
     </w:p>
-    <w:bookmarkEnd w:id="41"/>
-    <w:bookmarkStart w:id="42" w:name="section-27"/>
+    <w:bookmarkEnd w:id="44"/>
+    <w:bookmarkStart w:id="45" w:name="section-27"/>
     <w:p>
       <w:pPr>
         <w:pStyle w:val="Heading3"/>
@@ -2025,8 +2112,8 @@
         <w:t xml:space="preserve">Which distressed all the people of Ealing.</w:t>
       </w:r>
     </w:p>
-    <w:bookmarkEnd w:id="42"/>
-    <w:bookmarkStart w:id="43" w:name="section-28"/>
+    <w:bookmarkEnd w:id="45"/>
+    <w:bookmarkStart w:id="46" w:name="section-28"/>
     <w:p>
       <w:pPr>
         <w:pStyle w:val="Heading3"/>
@@ -2085,8 +2172,8 @@
         <w:t xml:space="preserve">To all the fat dogs in Kamschatka.</w:t>
       </w:r>
     </w:p>
-    <w:bookmarkEnd w:id="43"/>
-    <w:bookmarkStart w:id="44" w:name="section-29"/>
+    <w:bookmarkEnd w:id="46"/>
+    <w:bookmarkStart w:id="47" w:name="section-29"/>
     <w:p>
       <w:pPr>
         <w:pStyle w:val="Heading3"/>
@@ -2136,8 +2223,8 @@
         <w:t xml:space="preserve">And some she took with her to Troy.</w:t>
       </w:r>
     </w:p>
-    <w:bookmarkEnd w:id="44"/>
-    <w:bookmarkStart w:id="45" w:name="section-30"/>
+    <w:bookmarkEnd w:id="47"/>
+    <w:bookmarkStart w:id="48" w:name="section-30"/>
     <w:p>
       <w:pPr>
         <w:pStyle w:val="Heading3"/>
@@ -2187,8 +2274,8 @@
         <w:t xml:space="preserve">Which may soften the heart of that Cow.”</w:t>
       </w:r>
     </w:p>
-    <w:bookmarkEnd w:id="45"/>
-    <w:bookmarkStart w:id="46" w:name="section-31"/>
+    <w:bookmarkEnd w:id="48"/>
+    <w:bookmarkStart w:id="49" w:name="section-31"/>
     <w:p>
       <w:pPr>
         <w:pStyle w:val="Heading3"/>
@@ -2247,8 +2334,8 @@
         <w:t xml:space="preserve">It is four times as big as the bush!”</w:t>
       </w:r>
     </w:p>
-    <w:bookmarkEnd w:id="46"/>
-    <w:bookmarkStart w:id="47" w:name="section-32"/>
+    <w:bookmarkEnd w:id="49"/>
+    <w:bookmarkStart w:id="50" w:name="section-32"/>
     <w:p>
       <w:pPr>
         <w:pStyle w:val="Heading3"/>
@@ -2298,8 +2385,8 @@
         <w:t xml:space="preserve">Which grieved that Old Man of the Dee.</w:t>
       </w:r>
     </w:p>
-    <w:bookmarkEnd w:id="47"/>
-    <w:bookmarkStart w:id="48" w:name="section-33"/>
+    <w:bookmarkEnd w:id="50"/>
+    <w:bookmarkStart w:id="51" w:name="section-33"/>
     <w:p>
       <w:pPr>
         <w:pStyle w:val="Heading3"/>
@@ -2349,8 +2436,8 @@
         <w:t xml:space="preserve">They mended that Man of Nepal.</w:t>
       </w:r>
     </w:p>
-    <w:bookmarkEnd w:id="48"/>
-    <w:bookmarkStart w:id="49" w:name="section-34"/>
+    <w:bookmarkEnd w:id="51"/>
+    <w:bookmarkStart w:id="52" w:name="section-34"/>
     <w:p>
       <w:pPr>
         <w:pStyle w:val="Heading3"/>
@@ -2400,8 +2487,8 @@
         <w:t xml:space="preserve">That uncommon Old Man of Blackheath.</w:t>
       </w:r>
     </w:p>
-    <w:bookmarkEnd w:id="49"/>
-    <w:bookmarkStart w:id="50" w:name="section-35"/>
+    <w:bookmarkEnd w:id="52"/>
+    <w:bookmarkStart w:id="53" w:name="section-35"/>
     <w:p>
       <w:pPr>
         <w:pStyle w:val="Heading3"/>
@@ -2451,8 +2538,8 @@
         <w:t xml:space="preserve">So they smashed that Old Man of Whitehaven.</w:t>
       </w:r>
     </w:p>
-    <w:bookmarkEnd w:id="50"/>
-    <w:bookmarkStart w:id="51" w:name="section-36"/>
+    <w:bookmarkEnd w:id="53"/>
+    <w:bookmarkStart w:id="54" w:name="section-36"/>
     <w:p>
       <w:pPr>
         <w:pStyle w:val="Heading3"/>
@@ -2502,9 +2589,9 @@
         <w:t xml:space="preserve">He was choked, that Old Man of the South.</w:t>
       </w:r>
     </w:p>
-    <w:bookmarkEnd w:id="51"/>
-    <w:bookmarkEnd w:id="52"/>
-    <w:bookmarkStart w:id="69" w:name="food-drink-the-table"/>
+    <w:bookmarkEnd w:id="54"/>
+    <w:bookmarkEnd w:id="55"/>
+    <w:bookmarkStart w:id="72" w:name="food-drink-the-table"/>
     <w:p>
       <w:pPr>
         <w:pStyle w:val="Heading2"/>
@@ -2516,7 +2603,7 @@
         <w:t xml:space="preserve">Food, Drink &amp; the Table</w:t>
       </w:r>
     </w:p>
-    <w:bookmarkStart w:id="53" w:name="section-37"/>
+    <w:bookmarkStart w:id="56" w:name="section-37"/>
     <w:p>
       <w:pPr>
         <w:pStyle w:val="Heading3"/>
@@ -2566,8 +2653,8 @@
         <w:t xml:space="preserve">That imprudent Old Person of Chili.</w:t>
       </w:r>
     </w:p>
-    <w:bookmarkEnd w:id="53"/>
-    <w:bookmarkStart w:id="54" w:name="section-38"/>
+    <w:bookmarkEnd w:id="56"/>
+    <w:bookmarkStart w:id="57" w:name="section-38"/>
     <w:p>
       <w:pPr>
         <w:pStyle w:val="Heading3"/>
@@ -2617,8 +2704,8 @@
         <w:t xml:space="preserve">That wayward Old Man of Kilkenny.</w:t>
       </w:r>
     </w:p>
-    <w:bookmarkEnd w:id="54"/>
-    <w:bookmarkStart w:id="55" w:name="section-39"/>
+    <w:bookmarkEnd w:id="57"/>
+    <w:bookmarkStart w:id="58" w:name="section-39"/>
     <w:p>
       <w:pPr>
         <w:pStyle w:val="Heading3"/>
@@ -2668,8 +2755,8 @@
         <w:t xml:space="preserve">That lively Old Person of Ischia.</w:t>
       </w:r>
     </w:p>
-    <w:bookmarkEnd w:id="55"/>
-    <w:bookmarkStart w:id="56" w:name="section-40"/>
+    <w:bookmarkEnd w:id="58"/>
+    <w:bookmarkStart w:id="59" w:name="section-40"/>
     <w:p>
       <w:pPr>
         <w:pStyle w:val="Heading3"/>
@@ -2719,8 +2806,8 @@
         <w:t xml:space="preserve">That nasty Old Man of Vienna.</w:t>
       </w:r>
     </w:p>
-    <w:bookmarkEnd w:id="56"/>
-    <w:bookmarkStart w:id="57" w:name="section-41"/>
+    <w:bookmarkEnd w:id="59"/>
+    <w:bookmarkStart w:id="60" w:name="section-41"/>
     <w:p>
       <w:pPr>
         <w:pStyle w:val="Heading3"/>
@@ -2770,8 +2857,8 @@
         <w:t xml:space="preserve">Which agreed with that Person of Leeds.</w:t>
       </w:r>
     </w:p>
-    <w:bookmarkEnd w:id="57"/>
-    <w:bookmarkStart w:id="58" w:name="section-42"/>
+    <w:bookmarkEnd w:id="60"/>
+    <w:bookmarkStart w:id="61" w:name="section-42"/>
     <w:p>
       <w:pPr>
         <w:pStyle w:val="Heading3"/>
@@ -2821,8 +2908,8 @@
         <w:t xml:space="preserve">Upon which he relinquished those habits.</w:t>
       </w:r>
     </w:p>
-    <w:bookmarkEnd w:id="58"/>
-    <w:bookmarkStart w:id="59" w:name="section-43"/>
+    <w:bookmarkEnd w:id="61"/>
+    <w:bookmarkStart w:id="62" w:name="section-43"/>
     <w:p>
       <w:pPr>
         <w:pStyle w:val="Heading3"/>
@@ -2872,8 +2959,8 @@
         <w:t xml:space="preserve">At the heads of the people of Minety.</w:t>
       </w:r>
     </w:p>
-    <w:bookmarkEnd w:id="59"/>
-    <w:bookmarkStart w:id="60" w:name="section-44"/>
+    <w:bookmarkEnd w:id="62"/>
+    <w:bookmarkStart w:id="63" w:name="section-44"/>
     <w:p>
       <w:pPr>
         <w:pStyle w:val="Heading3"/>
@@ -2923,8 +3010,8 @@
         <w:t xml:space="preserve">You amazing old man on the Humber!”</w:t>
       </w:r>
     </w:p>
-    <w:bookmarkEnd w:id="60"/>
-    <w:bookmarkStart w:id="61" w:name="section-45"/>
+    <w:bookmarkEnd w:id="63"/>
+    <w:bookmarkStart w:id="64" w:name="section-45"/>
     <w:p>
       <w:pPr>
         <w:pStyle w:val="Heading3"/>
@@ -2974,8 +3061,8 @@
         <w:t xml:space="preserve">That romantic old person of Putney.</w:t>
       </w:r>
     </w:p>
-    <w:bookmarkEnd w:id="61"/>
-    <w:bookmarkStart w:id="62" w:name="section-46"/>
+    <w:bookmarkEnd w:id="64"/>
+    <w:bookmarkStart w:id="65" w:name="section-46"/>
     <w:p>
       <w:pPr>
         <w:pStyle w:val="Heading3"/>
@@ -3025,8 +3112,8 @@
         <w:t xml:space="preserve">Which relieved that old person of Pett.</w:t>
       </w:r>
     </w:p>
-    <w:bookmarkEnd w:id="62"/>
-    <w:bookmarkStart w:id="63" w:name="section-47"/>
+    <w:bookmarkEnd w:id="65"/>
+    <w:bookmarkStart w:id="66" w:name="section-47"/>
     <w:p>
       <w:pPr>
         <w:pStyle w:val="Heading3"/>
@@ -3076,8 +3163,8 @@
         <w:t xml:space="preserve">That valuable person of Bray.</w:t>
       </w:r>
     </w:p>
-    <w:bookmarkEnd w:id="63"/>
-    <w:bookmarkStart w:id="64" w:name="section-48"/>
+    <w:bookmarkEnd w:id="66"/>
+    <w:bookmarkStart w:id="67" w:name="section-48"/>
     <w:p>
       <w:pPr>
         <w:pStyle w:val="Heading3"/>
@@ -3136,8 +3223,8 @@
         <w:t xml:space="preserve">Choked that horrid Old Man of Calcutta.</w:t>
       </w:r>
     </w:p>
-    <w:bookmarkEnd w:id="64"/>
-    <w:bookmarkStart w:id="65" w:name="section-49"/>
+    <w:bookmarkEnd w:id="67"/>
+    <w:bookmarkStart w:id="68" w:name="section-49"/>
     <w:p>
       <w:pPr>
         <w:pStyle w:val="Heading3"/>
@@ -3187,8 +3274,8 @@
         <w:t xml:space="preserve">And called for some hot buttered toast.</w:t>
       </w:r>
     </w:p>
-    <w:bookmarkEnd w:id="65"/>
-    <w:bookmarkStart w:id="66" w:name="section-50"/>
+    <w:bookmarkEnd w:id="68"/>
+    <w:bookmarkStart w:id="69" w:name="section-50"/>
     <w:p>
       <w:pPr>
         <w:pStyle w:val="Heading3"/>
@@ -3238,8 +3325,8 @@
         <w:t xml:space="preserve">So they baked the old man of Berlin.</w:t>
       </w:r>
     </w:p>
-    <w:bookmarkEnd w:id="66"/>
-    <w:bookmarkStart w:id="67" w:name="section-51"/>
+    <w:bookmarkEnd w:id="69"/>
+    <w:bookmarkStart w:id="70" w:name="section-51"/>
     <w:p>
       <w:pPr>
         <w:pStyle w:val="Heading3"/>
@@ -3289,8 +3376,8 @@
         <w:t xml:space="preserve">That afflicted Old Person of Rheims!</w:t>
       </w:r>
     </w:p>
-    <w:bookmarkEnd w:id="67"/>
-    <w:bookmarkStart w:id="68" w:name="section-52"/>
+    <w:bookmarkEnd w:id="70"/>
+    <w:bookmarkStart w:id="71" w:name="section-52"/>
     <w:p>
       <w:pPr>
         <w:pStyle w:val="Heading3"/>
@@ -3340,9 +3427,9 @@
         <w:t xml:space="preserve">That it killed that Old Man of the East.</w:t>
       </w:r>
     </w:p>
-    <w:bookmarkEnd w:id="68"/>
-    <w:bookmarkEnd w:id="69"/>
-    <w:bookmarkStart w:id="92" w:name="hats-clothes-household-oddities"/>
+    <w:bookmarkEnd w:id="71"/>
+    <w:bookmarkEnd w:id="72"/>
+    <w:bookmarkStart w:id="95" w:name="hats-clothes-household-oddities"/>
     <w:p>
       <w:pPr>
         <w:pStyle w:val="Heading2"/>
@@ -3363,18 +3450,18 @@
           <wp:inline>
             <wp:extent cx="2743200" cy="4114799"/>
             <wp:effectExtent b="0" l="0" r="0" t="0"/>
-            <wp:docPr descr="Birds settle on a very large bonnet." title="" id="71" name="Picture"/>
+            <wp:docPr descr="Birds settle on a very large bonnet." title="" id="74" name="Picture"/>
             <a:graphic>
               <a:graphicData uri="http://schemas.openxmlformats.org/drawingml/2006/picture">
                 <pic:pic>
                   <pic:nvPicPr>
-                    <pic:cNvPr descr="images/04_bonnet_birds.jpg" id="72" name="Picture"/>
+                    <pic:cNvPr descr="images/04_bonnet_birds.jpg" id="75" name="Picture"/>
                     <pic:cNvPicPr>
                       <a:picLocks noChangeArrowheads="1" noChangeAspect="1"/>
                     </pic:cNvPicPr>
                   </pic:nvPicPr>
                   <pic:blipFill>
-                    <a:blip r:embed="rId70"/>
+                    <a:blip r:embed="rId73"/>
                     <a:stretch>
                       <a:fillRect/>
                     </a:stretch>
@@ -3412,7 +3499,7 @@
         <w:t xml:space="preserve">A bonnet with room for unexpected guests.</w:t>
       </w:r>
     </w:p>
-    <w:bookmarkStart w:id="73" w:name="section-53"/>
+    <w:bookmarkStart w:id="76" w:name="section-53"/>
     <w:p>
       <w:pPr>
         <w:pStyle w:val="Heading3"/>
@@ -3462,8 +3549,8 @@
         <w:t xml:space="preserve">That remarkable Man with a nose.</w:t>
       </w:r>
     </w:p>
-    <w:bookmarkEnd w:id="73"/>
-    <w:bookmarkStart w:id="74" w:name="section-54"/>
+    <w:bookmarkEnd w:id="76"/>
+    <w:bookmarkStart w:id="77" w:name="section-54"/>
     <w:p>
       <w:pPr>
         <w:pStyle w:val="Heading3"/>
@@ -3513,8 +3600,8 @@
         <w:t xml:space="preserve">Which adorned that Old Man on a hill.</w:t>
       </w:r>
     </w:p>
-    <w:bookmarkEnd w:id="74"/>
-    <w:bookmarkStart w:id="75" w:name="section-55"/>
+    <w:bookmarkEnd w:id="77"/>
+    <w:bookmarkStart w:id="78" w:name="section-55"/>
     <w:p>
       <w:pPr>
         <w:pStyle w:val="Heading3"/>
@@ -3564,8 +3651,8 @@
         <w:t xml:space="preserve">And avoided that Man with a flute.</w:t>
       </w:r>
     </w:p>
-    <w:bookmarkEnd w:id="75"/>
-    <w:bookmarkStart w:id="76" w:name="section-56"/>
+    <w:bookmarkEnd w:id="78"/>
+    <w:bookmarkStart w:id="79" w:name="section-56"/>
     <w:p>
       <w:pPr>
         <w:pStyle w:val="Heading3"/>
@@ -3615,8 +3702,8 @@
         <w:t xml:space="preserve">That uneasy Old Man of the West.</w:t>
       </w:r>
     </w:p>
-    <w:bookmarkEnd w:id="76"/>
-    <w:bookmarkStart w:id="77" w:name="section-57"/>
+    <w:bookmarkEnd w:id="79"/>
+    <w:bookmarkStart w:id="80" w:name="section-57"/>
     <w:p>
       <w:pPr>
         <w:pStyle w:val="Heading3"/>
@@ -3666,8 +3753,8 @@
         <w:t xml:space="preserve">Or of what, you Old Man of the Wrekin?”</w:t>
       </w:r>
     </w:p>
-    <w:bookmarkEnd w:id="77"/>
-    <w:bookmarkStart w:id="78" w:name="section-58"/>
+    <w:bookmarkEnd w:id="80"/>
+    <w:bookmarkStart w:id="81" w:name="section-58"/>
     <w:p>
       <w:pPr>
         <w:pStyle w:val="Heading3"/>
@@ -3717,8 +3804,8 @@
         <w:t xml:space="preserve">To carry that wonderful nose.</w:t>
       </w:r>
     </w:p>
-    <w:bookmarkEnd w:id="78"/>
-    <w:bookmarkStart w:id="79" w:name="section-59"/>
+    <w:bookmarkEnd w:id="81"/>
+    <w:bookmarkStart w:id="82" w:name="section-59"/>
     <w:p>
       <w:pPr>
         <w:pStyle w:val="Heading3"/>
@@ -3768,8 +3855,8 @@
         <w:t xml:space="preserve">That ecstatic Old Person of Tring.</w:t>
       </w:r>
     </w:p>
-    <w:bookmarkEnd w:id="79"/>
-    <w:bookmarkStart w:id="80" w:name="section-60"/>
+    <w:bookmarkEnd w:id="82"/>
+    <w:bookmarkStart w:id="83" w:name="section-60"/>
     <w:p>
       <w:pPr>
         <w:pStyle w:val="Heading3"/>
@@ -3819,8 +3906,8 @@
         <w:t xml:space="preserve">That she very soon went back to Dorking.</w:t>
       </w:r>
     </w:p>
-    <w:bookmarkEnd w:id="80"/>
-    <w:bookmarkStart w:id="81" w:name="section-61"/>
+    <w:bookmarkEnd w:id="83"/>
+    <w:bookmarkStart w:id="84" w:name="section-61"/>
     <w:p>
       <w:pPr>
         <w:pStyle w:val="Heading3"/>
@@ -3870,8 +3957,8 @@
         <w:t xml:space="preserve">You shall never remain in Thermopylae.”</w:t>
       </w:r>
     </w:p>
-    <w:bookmarkEnd w:id="81"/>
-    <w:bookmarkStart w:id="82" w:name="section-62"/>
+    <w:bookmarkEnd w:id="84"/>
+    <w:bookmarkStart w:id="85" w:name="section-62"/>
     <w:p>
       <w:pPr>
         <w:pStyle w:val="Heading3"/>
@@ -3921,8 +4008,8 @@
         <w:t xml:space="preserve">Which helped that old man in a barge.</w:t>
       </w:r>
     </w:p>
-    <w:bookmarkEnd w:id="82"/>
-    <w:bookmarkStart w:id="83" w:name="section-63"/>
+    <w:bookmarkEnd w:id="85"/>
+    <w:bookmarkStart w:id="86" w:name="section-63"/>
     <w:p>
       <w:pPr>
         <w:pStyle w:val="Heading3"/>
@@ -3972,8 +4059,8 @@
         <w:t xml:space="preserve">That turbid old man of Toulouse.</w:t>
       </w:r>
     </w:p>
-    <w:bookmarkEnd w:id="83"/>
-    <w:bookmarkStart w:id="84" w:name="section-64"/>
+    <w:bookmarkEnd w:id="86"/>
+    <w:bookmarkStart w:id="87" w:name="section-64"/>
     <w:p>
       <w:pPr>
         <w:pStyle w:val="Heading3"/>
@@ -4023,8 +4110,8 @@
         <w:t xml:space="preserve">To come under my hat at Dee-side!”</w:t>
       </w:r>
     </w:p>
-    <w:bookmarkEnd w:id="84"/>
-    <w:bookmarkStart w:id="85" w:name="section-65"/>
+    <w:bookmarkEnd w:id="87"/>
+    <w:bookmarkStart w:id="88" w:name="section-65"/>
     <w:p>
       <w:pPr>
         <w:pStyle w:val="Heading3"/>
@@ -4074,8 +4161,8 @@
         <w:t xml:space="preserve">Which enveloped that person in green.</w:t>
       </w:r>
     </w:p>
-    <w:bookmarkEnd w:id="85"/>
-    <w:bookmarkStart w:id="86" w:name="section-66"/>
+    <w:bookmarkEnd w:id="88"/>
+    <w:bookmarkStart w:id="89" w:name="section-66"/>
     <w:p>
       <w:pPr>
         <w:pStyle w:val="Heading3"/>
@@ -4125,8 +4212,8 @@
         <w:t xml:space="preserve">And continued to knock him about.</w:t>
       </w:r>
     </w:p>
-    <w:bookmarkEnd w:id="86"/>
-    <w:bookmarkStart w:id="87" w:name="section-67"/>
+    <w:bookmarkEnd w:id="89"/>
+    <w:bookmarkStart w:id="90" w:name="section-67"/>
     <w:p>
       <w:pPr>
         <w:pStyle w:val="Heading3"/>
@@ -4176,8 +4263,8 @@
         <w:t xml:space="preserve">Besides some long ribands of red.</w:t>
       </w:r>
     </w:p>
-    <w:bookmarkEnd w:id="87"/>
-    <w:bookmarkStart w:id="88" w:name="section-68"/>
+    <w:bookmarkEnd w:id="90"/>
+    <w:bookmarkStart w:id="91" w:name="section-68"/>
     <w:p>
       <w:pPr>
         <w:pStyle w:val="Heading3"/>
@@ -4227,8 +4314,8 @@
         <w:t xml:space="preserve">Which perplexed that old person of Cassel.</w:t>
       </w:r>
     </w:p>
-    <w:bookmarkEnd w:id="88"/>
-    <w:bookmarkStart w:id="89" w:name="section-69"/>
+    <w:bookmarkEnd w:id="91"/>
+    <w:bookmarkStart w:id="92" w:name="section-69"/>
     <w:p>
       <w:pPr>
         <w:pStyle w:val="Heading3"/>
@@ -4278,8 +4365,8 @@
         <w:t xml:space="preserve">And was heard through the whole of West Dumpet.</w:t>
       </w:r>
     </w:p>
-    <w:bookmarkEnd w:id="89"/>
-    <w:bookmarkStart w:id="90" w:name="section-70"/>
+    <w:bookmarkEnd w:id="92"/>
+    <w:bookmarkStart w:id="93" w:name="section-70"/>
     <w:p>
       <w:pPr>
         <w:pStyle w:val="Heading3"/>
@@ -4329,8 +4416,8 @@
         <w:t xml:space="preserve">“Oh! Farewell to the end of my nose!”</w:t>
       </w:r>
     </w:p>
-    <w:bookmarkEnd w:id="90"/>
-    <w:bookmarkStart w:id="91" w:name="section-71"/>
+    <w:bookmarkEnd w:id="93"/>
+    <w:bookmarkStart w:id="94" w:name="section-71"/>
     <w:p>
       <w:pPr>
         <w:pStyle w:val="Heading3"/>
@@ -4380,9 +4467,9 @@
         <w:t xml:space="preserve">You abruptious old man of Thames Ditton!”</w:t>
       </w:r>
     </w:p>
-    <w:bookmarkEnd w:id="91"/>
-    <w:bookmarkEnd w:id="92"/>
-    <w:bookmarkStart w:id="115" w:name="journeys-escapes-mishaps"/>
+    <w:bookmarkEnd w:id="94"/>
+    <w:bookmarkEnd w:id="95"/>
+    <w:bookmarkStart w:id="118" w:name="journeys-escapes-mishaps"/>
     <w:p>
       <w:pPr>
         <w:pStyle w:val="Heading2"/>
@@ -4394,7 +4481,7 @@
         <w:t xml:space="preserve">Journeys, Escapes &amp; Mishaps</w:t>
       </w:r>
     </w:p>
-    <w:bookmarkStart w:id="93" w:name="section-72"/>
+    <w:bookmarkStart w:id="96" w:name="section-72"/>
     <w:p>
       <w:pPr>
         <w:pStyle w:val="Heading3"/>
@@ -4444,8 +4531,8 @@
         <w:t xml:space="preserve">But declared she would never leave Portugal.</w:t>
       </w:r>
     </w:p>
-    <w:bookmarkEnd w:id="93"/>
-    <w:bookmarkStart w:id="94" w:name="section-73"/>
+    <w:bookmarkEnd w:id="96"/>
+    <w:bookmarkStart w:id="97" w:name="section-73"/>
     <w:p>
       <w:pPr>
         <w:pStyle w:val="Heading3"/>
@@ -4495,8 +4582,8 @@
         <w:t xml:space="preserve">That unhappy Old Man in a boat.</w:t>
       </w:r>
     </w:p>
-    <w:bookmarkEnd w:id="94"/>
-    <w:bookmarkStart w:id="95" w:name="section-74"/>
+    <w:bookmarkEnd w:id="97"/>
+    <w:bookmarkStart w:id="98" w:name="section-74"/>
     <w:p>
       <w:pPr>
         <w:pStyle w:val="Heading3"/>
@@ -4546,8 +4633,8 @@
         <w:t xml:space="preserve">And escaped from the people of Basing.</w:t>
       </w:r>
     </w:p>
-    <w:bookmarkEnd w:id="95"/>
-    <w:bookmarkStart w:id="96" w:name="section-75"/>
+    <w:bookmarkEnd w:id="98"/>
+    <w:bookmarkStart w:id="99" w:name="section-75"/>
     <w:p>
       <w:pPr>
         <w:pStyle w:val="Heading3"/>
@@ -4597,8 +4684,8 @@
         <w:t xml:space="preserve">That angry Old Man of Quebec.</w:t>
       </w:r>
     </w:p>
-    <w:bookmarkEnd w:id="96"/>
-    <w:bookmarkStart w:id="97" w:name="section-76"/>
+    <w:bookmarkEnd w:id="99"/>
+    <w:bookmarkStart w:id="100" w:name="section-76"/>
     <w:p>
       <w:pPr>
         <w:pStyle w:val="Heading3"/>
@@ -4648,8 +4735,8 @@
         <w:t xml:space="preserve">And swam back again into Bree.</w:t>
       </w:r>
     </w:p>
-    <w:bookmarkEnd w:id="97"/>
-    <w:bookmarkStart w:id="98" w:name="section-77"/>
+    <w:bookmarkEnd w:id="100"/>
+    <w:bookmarkStart w:id="101" w:name="section-77"/>
     <w:p>
       <w:pPr>
         <w:pStyle w:val="Heading3"/>
@@ -4699,8 +4786,8 @@
         <w:t xml:space="preserve">That vexatious old person of Loo.</w:t>
       </w:r>
     </w:p>
-    <w:bookmarkEnd w:id="98"/>
-    <w:bookmarkStart w:id="99" w:name="section-78"/>
+    <w:bookmarkEnd w:id="101"/>
+    <w:bookmarkStart w:id="102" w:name="section-78"/>
     <w:p>
       <w:pPr>
         <w:pStyle w:val="Heading3"/>
@@ -4750,8 +4837,8 @@
         <w:t xml:space="preserve">And entranced all the people of Skye.</w:t>
       </w:r>
     </w:p>
-    <w:bookmarkEnd w:id="99"/>
-    <w:bookmarkStart w:id="100" w:name="section-79"/>
+    <w:bookmarkEnd w:id="102"/>
+    <w:bookmarkStart w:id="103" w:name="section-79"/>
     <w:p>
       <w:pPr>
         <w:pStyle w:val="Heading3"/>
@@ -4801,8 +4888,8 @@
         <w:t xml:space="preserve">You abstemious old person of Rye!”</w:t>
       </w:r>
     </w:p>
-    <w:bookmarkEnd w:id="100"/>
-    <w:bookmarkStart w:id="101" w:name="section-80"/>
+    <w:bookmarkEnd w:id="103"/>
+    <w:bookmarkStart w:id="104" w:name="section-80"/>
     <w:p>
       <w:pPr>
         <w:pStyle w:val="Heading3"/>
@@ -4852,8 +4939,8 @@
         <w:t xml:space="preserve">“I had better go back to Dundalk!”</w:t>
       </w:r>
     </w:p>
-    <w:bookmarkEnd w:id="101"/>
-    <w:bookmarkStart w:id="102" w:name="section-81"/>
+    <w:bookmarkEnd w:id="104"/>
+    <w:bookmarkStart w:id="105" w:name="section-81"/>
     <w:p>
       <w:pPr>
         <w:pStyle w:val="Heading3"/>
@@ -4903,8 +4990,8 @@
         <w:t xml:space="preserve">And I trust you’ll go out of my garden.”</w:t>
       </w:r>
     </w:p>
-    <w:bookmarkEnd w:id="102"/>
-    <w:bookmarkStart w:id="103" w:name="section-82"/>
+    <w:bookmarkEnd w:id="105"/>
+    <w:bookmarkStart w:id="106" w:name="section-82"/>
     <w:p>
       <w:pPr>
         <w:pStyle w:val="Heading3"/>
@@ -4954,8 +5041,8 @@
         <w:t xml:space="preserve">He’s a Moppsikon Floppsikon bear!”</w:t>
       </w:r>
     </w:p>
-    <w:bookmarkEnd w:id="103"/>
-    <w:bookmarkStart w:id="104" w:name="section-83"/>
+    <w:bookmarkEnd w:id="106"/>
+    <w:bookmarkStart w:id="107" w:name="section-83"/>
     <w:p>
       <w:pPr>
         <w:pStyle w:val="Heading3"/>
@@ -5005,8 +5092,8 @@
         <w:t xml:space="preserve">That elegant person of Wilts.</w:t>
       </w:r>
     </w:p>
-    <w:bookmarkEnd w:id="104"/>
-    <w:bookmarkStart w:id="105" w:name="section-84"/>
+    <w:bookmarkEnd w:id="107"/>
+    <w:bookmarkStart w:id="108" w:name="section-84"/>
     <w:p>
       <w:pPr>
         <w:pStyle w:val="Heading3"/>
@@ -5056,8 +5143,8 @@
         <w:t xml:space="preserve">That aquatic old person of Grange.</w:t>
       </w:r>
     </w:p>
-    <w:bookmarkEnd w:id="105"/>
-    <w:bookmarkStart w:id="106" w:name="section-85"/>
+    <w:bookmarkEnd w:id="108"/>
+    <w:bookmarkStart w:id="109" w:name="section-85"/>
     <w:p>
       <w:pPr>
         <w:pStyle w:val="Heading3"/>
@@ -5107,8 +5194,8 @@
         <w:t xml:space="preserve">Which partly assuaged his despair.</w:t>
       </w:r>
     </w:p>
-    <w:bookmarkEnd w:id="106"/>
-    <w:bookmarkStart w:id="107" w:name="section-86"/>
+    <w:bookmarkEnd w:id="109"/>
+    <w:bookmarkStart w:id="110" w:name="section-86"/>
     <w:p>
       <w:pPr>
         <w:pStyle w:val="Heading3"/>
@@ -5158,8 +5245,8 @@
         <w:t xml:space="preserve">That moony old person of Ickley.</w:t>
       </w:r>
     </w:p>
-    <w:bookmarkEnd w:id="107"/>
-    <w:bookmarkStart w:id="108" w:name="section-87"/>
+    <w:bookmarkEnd w:id="110"/>
+    <w:bookmarkStart w:id="111" w:name="section-87"/>
     <w:p>
       <w:pPr>
         <w:pStyle w:val="Heading3"/>
@@ -5209,8 +5296,8 @@
         <w:t xml:space="preserve">And they said, “Would we’d never left Hyde!”</w:t>
       </w:r>
     </w:p>
-    <w:bookmarkEnd w:id="108"/>
-    <w:bookmarkStart w:id="109" w:name="section-88"/>
+    <w:bookmarkEnd w:id="111"/>
+    <w:bookmarkStart w:id="112" w:name="section-88"/>
     <w:p>
       <w:pPr>
         <w:pStyle w:val="Heading3"/>
@@ -5260,8 +5347,8 @@
         <w:t xml:space="preserve">And was never more heard of at Rimini.</w:t>
       </w:r>
     </w:p>
-    <w:bookmarkEnd w:id="109"/>
-    <w:bookmarkStart w:id="110" w:name="section-89"/>
+    <w:bookmarkEnd w:id="112"/>
+    <w:bookmarkStart w:id="113" w:name="section-89"/>
     <w:p>
       <w:pPr>
         <w:pStyle w:val="Heading3"/>
@@ -5311,8 +5398,8 @@
         <w:t xml:space="preserve">You will go back directly to Bow!”</w:t>
       </w:r>
     </w:p>
-    <w:bookmarkEnd w:id="110"/>
-    <w:bookmarkStart w:id="111" w:name="section-90"/>
+    <w:bookmarkEnd w:id="113"/>
+    <w:bookmarkStart w:id="114" w:name="section-90"/>
     <w:p>
       <w:pPr>
         <w:pStyle w:val="Heading3"/>
@@ -5371,8 +5458,8 @@
         <w:t xml:space="preserve">You stupid Old Man of Melrose.</w:t>
       </w:r>
     </w:p>
-    <w:bookmarkEnd w:id="111"/>
-    <w:bookmarkStart w:id="112" w:name="section-91"/>
+    <w:bookmarkEnd w:id="114"/>
+    <w:bookmarkStart w:id="115" w:name="section-91"/>
     <w:p>
       <w:pPr>
         <w:pStyle w:val="Heading3"/>
@@ -5431,8 +5518,8 @@
         <w:t xml:space="preserve">Which embarrassed the people of Lucca.</w:t>
       </w:r>
     </w:p>
-    <w:bookmarkEnd w:id="112"/>
-    <w:bookmarkStart w:id="113" w:name="section-92"/>
+    <w:bookmarkEnd w:id="115"/>
+    <w:bookmarkStart w:id="116" w:name="section-92"/>
     <w:p>
       <w:pPr>
         <w:pStyle w:val="Heading3"/>
@@ -5491,8 +5578,8 @@
         <w:t xml:space="preserve">To a leg, sir, of mutton you may go.</w:t>
       </w:r>
     </w:p>
-    <w:bookmarkEnd w:id="113"/>
-    <w:bookmarkStart w:id="114" w:name="section-93"/>
+    <w:bookmarkEnd w:id="116"/>
+    <w:bookmarkStart w:id="117" w:name="section-93"/>
     <w:p>
       <w:pPr>
         <w:pStyle w:val="Heading3"/>
@@ -5551,9 +5638,9 @@
         <w:t xml:space="preserve">Which astonished that Girl of Majorca.</w:t>
       </w:r>
     </w:p>
-    <w:bookmarkEnd w:id="114"/>
-    <w:bookmarkEnd w:id="115"/>
-    <w:bookmarkStart w:id="181" w:name="old-men-other-eccentrics"/>
+    <w:bookmarkEnd w:id="117"/>
+    <w:bookmarkEnd w:id="118"/>
+    <w:bookmarkStart w:id="184" w:name="old-men-other-eccentrics"/>
     <w:p>
       <w:pPr>
         <w:pStyle w:val="Heading2"/>
@@ -5565,7 +5652,7 @@
         <w:t xml:space="preserve">Old Men &amp; Other Eccentrics</w:t>
       </w:r>
     </w:p>
-    <w:bookmarkStart w:id="116" w:name="section-94"/>
+    <w:bookmarkStart w:id="119" w:name="section-94"/>
     <w:p>
       <w:pPr>
         <w:pStyle w:val="Heading3"/>
@@ -5615,8 +5702,8 @@
         <w:t xml:space="preserve">So they smashed that Old Man with a gong.</w:t>
       </w:r>
     </w:p>
-    <w:bookmarkEnd w:id="116"/>
-    <w:bookmarkStart w:id="117" w:name="section-95"/>
+    <w:bookmarkEnd w:id="119"/>
+    <w:bookmarkStart w:id="120" w:name="section-95"/>
     <w:p>
       <w:pPr>
         <w:pStyle w:val="Heading3"/>
@@ -5666,8 +5753,8 @@
         <w:t xml:space="preserve">Which disgusted that man of Columbia.</w:t>
       </w:r>
     </w:p>
-    <w:bookmarkEnd w:id="117"/>
-    <w:bookmarkStart w:id="118" w:name="section-96"/>
+    <w:bookmarkEnd w:id="120"/>
+    <w:bookmarkStart w:id="121" w:name="section-96"/>
     <w:p>
       <w:pPr>
         <w:pStyle w:val="Heading3"/>
@@ -5717,8 +5804,8 @@
         <w:t xml:space="preserve">Which distressed all the people of Chertsey.</w:t>
       </w:r>
     </w:p>
-    <w:bookmarkEnd w:id="118"/>
-    <w:bookmarkStart w:id="119" w:name="section-97"/>
+    <w:bookmarkEnd w:id="121"/>
+    <w:bookmarkStart w:id="122" w:name="section-97"/>
     <w:p>
       <w:pPr>
         <w:pStyle w:val="Heading3"/>
@@ -5768,8 +5855,8 @@
         <w:t xml:space="preserve">By smashing that Person of Buda.</w:t>
       </w:r>
     </w:p>
-    <w:bookmarkEnd w:id="119"/>
-    <w:bookmarkStart w:id="120" w:name="section-98"/>
+    <w:bookmarkEnd w:id="122"/>
+    <w:bookmarkStart w:id="123" w:name="section-98"/>
     <w:p>
       <w:pPr>
         <w:pStyle w:val="Heading3"/>
@@ -5819,8 +5906,8 @@
         <w:t xml:space="preserve">That funny Old Man of Moldavia.</w:t>
       </w:r>
     </w:p>
-    <w:bookmarkEnd w:id="120"/>
-    <w:bookmarkStart w:id="121" w:name="section-99"/>
+    <w:bookmarkEnd w:id="123"/>
+    <w:bookmarkStart w:id="124" w:name="section-99"/>
     <w:p>
       <w:pPr>
         <w:pStyle w:val="Heading3"/>
@@ -5870,8 +5957,8 @@
         <w:t xml:space="preserve">That globular Person of Hurst.</w:t>
       </w:r>
     </w:p>
-    <w:bookmarkEnd w:id="121"/>
-    <w:bookmarkStart w:id="122" w:name="section-100"/>
+    <w:bookmarkEnd w:id="124"/>
+    <w:bookmarkStart w:id="125" w:name="section-100"/>
     <w:p>
       <w:pPr>
         <w:pStyle w:val="Heading3"/>
@@ -5921,8 +6008,8 @@
         <w:t xml:space="preserve">Which drowned that Old Person of Cadiz.</w:t>
       </w:r>
     </w:p>
-    <w:bookmarkEnd w:id="122"/>
-    <w:bookmarkStart w:id="123" w:name="section-101"/>
+    <w:bookmarkEnd w:id="125"/>
+    <w:bookmarkStart w:id="126" w:name="section-101"/>
     <w:p>
       <w:pPr>
         <w:pStyle w:val="Heading3"/>
@@ -5972,8 +6059,8 @@
         <w:t xml:space="preserve">That amiable Man of the Isles.</w:t>
       </w:r>
     </w:p>
-    <w:bookmarkEnd w:id="123"/>
-    <w:bookmarkStart w:id="124" w:name="section-102"/>
+    <w:bookmarkEnd w:id="126"/>
+    <w:bookmarkStart w:id="127" w:name="section-102"/>
     <w:p>
       <w:pPr>
         <w:pStyle w:val="Heading3"/>
@@ -6023,8 +6110,8 @@
         <w:t xml:space="preserve">That whimsical Man of Apulia.</w:t>
       </w:r>
     </w:p>
-    <w:bookmarkEnd w:id="124"/>
-    <w:bookmarkStart w:id="125" w:name="section-103"/>
+    <w:bookmarkEnd w:id="127"/>
+    <w:bookmarkStart w:id="128" w:name="section-103"/>
     <w:p>
       <w:pPr>
         <w:pStyle w:val="Heading3"/>
@@ -6074,8 +6161,8 @@
         <w:t xml:space="preserve">And observed all the ruins of Philœ.</w:t>
       </w:r>
     </w:p>
-    <w:bookmarkEnd w:id="125"/>
-    <w:bookmarkStart w:id="126" w:name="section-104"/>
+    <w:bookmarkEnd w:id="128"/>
+    <w:bookmarkStart w:id="129" w:name="section-104"/>
     <w:p>
       <w:pPr>
         <w:pStyle w:val="Heading3"/>
@@ -6125,8 +6212,8 @@
         <w:t xml:space="preserve">But knocked them all down with his poker.</w:t>
       </w:r>
     </w:p>
-    <w:bookmarkEnd w:id="126"/>
-    <w:bookmarkStart w:id="127" w:name="section-105"/>
+    <w:bookmarkEnd w:id="129"/>
+    <w:bookmarkStart w:id="130" w:name="section-105"/>
     <w:p>
       <w:pPr>
         <w:pStyle w:val="Heading3"/>
@@ -6176,8 +6263,8 @@
         <w:t xml:space="preserve">And cured that Old Person of Prague.</w:t>
       </w:r>
     </w:p>
-    <w:bookmarkEnd w:id="127"/>
-    <w:bookmarkStart w:id="128" w:name="section-106"/>
+    <w:bookmarkEnd w:id="130"/>
+    <w:bookmarkStart w:id="131" w:name="section-106"/>
     <w:p>
       <w:pPr>
         <w:pStyle w:val="Heading3"/>
@@ -6227,8 +6314,8 @@
         <w:t xml:space="preserve">That unfortunate Man of Peru.</w:t>
       </w:r>
     </w:p>
-    <w:bookmarkEnd w:id="128"/>
-    <w:bookmarkStart w:id="129" w:name="section-107"/>
+    <w:bookmarkEnd w:id="131"/>
+    <w:bookmarkStart w:id="132" w:name="section-107"/>
     <w:p>
       <w:pPr>
         <w:pStyle w:val="Heading3"/>
@@ -6278,8 +6365,8 @@
         <w:t xml:space="preserve">Which saved that Old Man of the North.</w:t>
       </w:r>
     </w:p>
-    <w:bookmarkEnd w:id="129"/>
-    <w:bookmarkStart w:id="130" w:name="section-108"/>
+    <w:bookmarkEnd w:id="132"/>
+    <w:bookmarkStart w:id="133" w:name="section-108"/>
     <w:p>
       <w:pPr>
         <w:pStyle w:val="Heading3"/>
@@ -6329,8 +6416,8 @@
         <w:t xml:space="preserve">In sight of the city of Troy.</w:t>
       </w:r>
     </w:p>
-    <w:bookmarkEnd w:id="130"/>
-    <w:bookmarkStart w:id="131" w:name="section-109"/>
+    <w:bookmarkEnd w:id="133"/>
+    <w:bookmarkStart w:id="134" w:name="section-109"/>
     <w:p>
       <w:pPr>
         <w:pStyle w:val="Heading3"/>
@@ -6380,8 +6467,8 @@
         <w:t xml:space="preserve">And wrapped himself well from the cold.</w:t>
       </w:r>
     </w:p>
-    <w:bookmarkEnd w:id="131"/>
-    <w:bookmarkStart w:id="132" w:name="section-110"/>
+    <w:bookmarkEnd w:id="134"/>
+    <w:bookmarkStart w:id="135" w:name="section-110"/>
     <w:p>
       <w:pPr>
         <w:pStyle w:val="Heading3"/>
@@ -6431,8 +6518,8 @@
         <w:t xml:space="preserve">That dolorous Man of Cape Horn.</w:t>
       </w:r>
     </w:p>
-    <w:bookmarkEnd w:id="132"/>
-    <w:bookmarkStart w:id="133" w:name="section-111"/>
+    <w:bookmarkEnd w:id="135"/>
+    <w:bookmarkStart w:id="136" w:name="section-111"/>
     <w:p>
       <w:pPr>
         <w:pStyle w:val="Heading3"/>
@@ -6482,8 +6569,8 @@
         <w:t xml:space="preserve">Which concluded that Person of Cromer.</w:t>
       </w:r>
     </w:p>
-    <w:bookmarkEnd w:id="133"/>
-    <w:bookmarkStart w:id="134" w:name="section-112"/>
+    <w:bookmarkEnd w:id="136"/>
+    <w:bookmarkStart w:id="137" w:name="section-112"/>
     <w:p>
       <w:pPr>
         <w:pStyle w:val="Heading3"/>
@@ -6533,8 +6620,8 @@
         <w:t xml:space="preserve">That deluded Old Man of the Hague.</w:t>
       </w:r>
     </w:p>
-    <w:bookmarkEnd w:id="134"/>
-    <w:bookmarkStart w:id="135" w:name="section-113"/>
+    <w:bookmarkEnd w:id="137"/>
+    <w:bookmarkStart w:id="138" w:name="section-113"/>
     <w:p>
       <w:pPr>
         <w:pStyle w:val="Heading3"/>
@@ -6584,8 +6671,8 @@
         <w:t xml:space="preserve">That umbrageous Old Person of Spain.</w:t>
       </w:r>
     </w:p>
-    <w:bookmarkEnd w:id="135"/>
-    <w:bookmarkStart w:id="136" w:name="section-114"/>
+    <w:bookmarkEnd w:id="138"/>
+    <w:bookmarkStart w:id="139" w:name="section-114"/>
     <w:p>
       <w:pPr>
         <w:pStyle w:val="Heading3"/>
@@ -6635,8 +6722,8 @@
         <w:t xml:space="preserve">But nobody answers this bell!”</w:t>
       </w:r>
     </w:p>
-    <w:bookmarkEnd w:id="136"/>
-    <w:bookmarkStart w:id="137" w:name="section-115"/>
+    <w:bookmarkEnd w:id="139"/>
+    <w:bookmarkStart w:id="140" w:name="section-115"/>
     <w:p>
       <w:pPr>
         <w:pStyle w:val="Heading3"/>
@@ -6686,8 +6773,8 @@
         <w:t xml:space="preserve">That incipient Old Man in a casement.</w:t>
       </w:r>
     </w:p>
-    <w:bookmarkEnd w:id="137"/>
-    <w:bookmarkStart w:id="138" w:name="section-116"/>
+    <w:bookmarkEnd w:id="140"/>
+    <w:bookmarkStart w:id="141" w:name="section-116"/>
     <w:p>
       <w:pPr>
         <w:pStyle w:val="Heading3"/>
@@ -6737,8 +6824,8 @@
         <w:t xml:space="preserve">That intrinsic Old Man of Peru.</w:t>
       </w:r>
     </w:p>
-    <w:bookmarkEnd w:id="138"/>
-    <w:bookmarkStart w:id="139" w:name="section-117"/>
+    <w:bookmarkEnd w:id="141"/>
+    <w:bookmarkStart w:id="142" w:name="section-117"/>
     <w:p>
       <w:pPr>
         <w:pStyle w:val="Heading3"/>
@@ -6788,8 +6875,8 @@
         <w:t xml:space="preserve">But remained on the rails of the Junction.</w:t>
       </w:r>
     </w:p>
-    <w:bookmarkEnd w:id="139"/>
-    <w:bookmarkStart w:id="140" w:name="section-118"/>
+    <w:bookmarkEnd w:id="142"/>
+    <w:bookmarkStart w:id="143" w:name="section-118"/>
     <w:p>
       <w:pPr>
         <w:pStyle w:val="Heading3"/>
@@ -6839,8 +6926,8 @@
         <w:t xml:space="preserve">That mysterious old person of Deal.</w:t>
       </w:r>
     </w:p>
-    <w:bookmarkEnd w:id="140"/>
-    <w:bookmarkStart w:id="141" w:name="section-119"/>
+    <w:bookmarkEnd w:id="143"/>
+    <w:bookmarkStart w:id="144" w:name="section-119"/>
     <w:p>
       <w:pPr>
         <w:pStyle w:val="Heading3"/>
@@ -6890,8 +6977,8 @@
         <w:t xml:space="preserve">That unpleasing old person of Bromley.</w:t>
       </w:r>
     </w:p>
-    <w:bookmarkEnd w:id="141"/>
-    <w:bookmarkStart w:id="142" w:name="section-120"/>
+    <w:bookmarkEnd w:id="144"/>
+    <w:bookmarkStart w:id="145" w:name="section-120"/>
     <w:p>
       <w:pPr>
         <w:pStyle w:val="Heading3"/>
@@ -6941,8 +7028,8 @@
         <w:t xml:space="preserve">That helpless old person in black.</w:t>
       </w:r>
     </w:p>
-    <w:bookmarkEnd w:id="142"/>
-    <w:bookmarkStart w:id="143" w:name="section-121"/>
+    <w:bookmarkEnd w:id="145"/>
+    <w:bookmarkStart w:id="146" w:name="section-121"/>
     <w:p>
       <w:pPr>
         <w:pStyle w:val="Heading3"/>
@@ -6992,8 +7079,8 @@
         <w:t xml:space="preserve">That elastic old person of Pinner.</w:t>
       </w:r>
     </w:p>
-    <w:bookmarkEnd w:id="143"/>
-    <w:bookmarkStart w:id="144" w:name="section-122"/>
+    <w:bookmarkEnd w:id="146"/>
+    <w:bookmarkStart w:id="147" w:name="section-122"/>
     <w:p>
       <w:pPr>
         <w:pStyle w:val="Heading3"/>
@@ -7043,8 +7130,8 @@
         <w:t xml:space="preserve">And all of them settled in China.</w:t>
       </w:r>
     </w:p>
-    <w:bookmarkEnd w:id="144"/>
-    <w:bookmarkStart w:id="145" w:name="section-123"/>
+    <w:bookmarkEnd w:id="147"/>
+    <w:bookmarkStart w:id="148" w:name="section-123"/>
     <w:p>
       <w:pPr>
         <w:pStyle w:val="Heading3"/>
@@ -7094,8 +7181,8 @@
         <w:t xml:space="preserve">That instructive old man in a Marsh.</w:t>
       </w:r>
     </w:p>
-    <w:bookmarkEnd w:id="145"/>
-    <w:bookmarkStart w:id="146" w:name="section-124"/>
+    <w:bookmarkEnd w:id="148"/>
+    <w:bookmarkStart w:id="149" w:name="section-124"/>
     <w:p>
       <w:pPr>
         <w:pStyle w:val="Heading3"/>
@@ -7145,8 +7232,8 @@
         <w:t xml:space="preserve">That laconic old person of Wick.</w:t>
       </w:r>
     </w:p>
-    <w:bookmarkEnd w:id="146"/>
-    <w:bookmarkStart w:id="147" w:name="section-125"/>
+    <w:bookmarkEnd w:id="149"/>
+    <w:bookmarkStart w:id="150" w:name="section-125"/>
     <w:p>
       <w:pPr>
         <w:pStyle w:val="Heading3"/>
@@ -7196,8 +7283,8 @@
         <w:t xml:space="preserve">You afflicting old man at a Station!”</w:t>
       </w:r>
     </w:p>
-    <w:bookmarkEnd w:id="147"/>
-    <w:bookmarkStart w:id="148" w:name="section-126"/>
+    <w:bookmarkEnd w:id="150"/>
+    <w:bookmarkStart w:id="151" w:name="section-126"/>
     <w:p>
       <w:pPr>
         <w:pStyle w:val="Heading3"/>
@@ -7247,8 +7334,8 @@
         <w:t xml:space="preserve">Which relieved that old man of Three Bridges.</w:t>
       </w:r>
     </w:p>
-    <w:bookmarkEnd w:id="148"/>
-    <w:bookmarkStart w:id="149" w:name="section-127"/>
+    <w:bookmarkEnd w:id="151"/>
+    <w:bookmarkStart w:id="152" w:name="section-127"/>
     <w:p>
       <w:pPr>
         <w:pStyle w:val="Heading3"/>
@@ -7298,8 +7385,8 @@
         <w:t xml:space="preserve">That innocuous old man of Hong Kong.</w:t>
       </w:r>
     </w:p>
-    <w:bookmarkEnd w:id="149"/>
-    <w:bookmarkStart w:id="150" w:name="section-128"/>
+    <w:bookmarkEnd w:id="152"/>
+    <w:bookmarkStart w:id="153" w:name="section-128"/>
     <w:p>
       <w:pPr>
         <w:pStyle w:val="Heading3"/>
@@ -7349,8 +7436,8 @@
         <w:t xml:space="preserve">Which cured that old person of Fife.</w:t>
       </w:r>
     </w:p>
-    <w:bookmarkEnd w:id="150"/>
-    <w:bookmarkStart w:id="151" w:name="section-129"/>
+    <w:bookmarkEnd w:id="153"/>
+    <w:bookmarkStart w:id="154" w:name="section-129"/>
     <w:p>
       <w:pPr>
         <w:pStyle w:val="Heading3"/>
@@ -7400,8 +7487,8 @@
         <w:t xml:space="preserve">You imprudent old person of Slough.”</w:t>
       </w:r>
     </w:p>
-    <w:bookmarkEnd w:id="151"/>
-    <w:bookmarkStart w:id="152" w:name="section-130"/>
+    <w:bookmarkEnd w:id="154"/>
+    <w:bookmarkStart w:id="155" w:name="section-130"/>
     <w:p>
       <w:pPr>
         <w:pStyle w:val="Heading3"/>
@@ -7451,8 +7538,8 @@
         <w:t xml:space="preserve">He alarmed all the people of Down.</w:t>
       </w:r>
     </w:p>
-    <w:bookmarkEnd w:id="152"/>
-    <w:bookmarkStart w:id="153" w:name="section-131"/>
+    <w:bookmarkEnd w:id="155"/>
+    <w:bookmarkStart w:id="156" w:name="section-131"/>
     <w:p>
       <w:pPr>
         <w:pStyle w:val="Heading3"/>
@@ -7502,8 +7589,8 @@
         <w:t xml:space="preserve">That tranquil old person of Hove.</w:t>
       </w:r>
     </w:p>
-    <w:bookmarkEnd w:id="153"/>
-    <w:bookmarkStart w:id="154" w:name="section-132"/>
+    <w:bookmarkEnd w:id="156"/>
+    <w:bookmarkStart w:id="157" w:name="section-132"/>
     <w:p>
       <w:pPr>
         <w:pStyle w:val="Heading3"/>
@@ -7553,8 +7640,8 @@
         <w:t xml:space="preserve">That illusive old person of Woking.</w:t>
       </w:r>
     </w:p>
-    <w:bookmarkEnd w:id="154"/>
-    <w:bookmarkStart w:id="155" w:name="section-133"/>
+    <w:bookmarkEnd w:id="157"/>
+    <w:bookmarkStart w:id="158" w:name="section-133"/>
     <w:p>
       <w:pPr>
         <w:pStyle w:val="Heading3"/>
@@ -7604,8 +7691,8 @@
         <w:t xml:space="preserve">That cautious old person of Dean.</w:t>
       </w:r>
     </w:p>
-    <w:bookmarkEnd w:id="155"/>
-    <w:bookmarkStart w:id="156" w:name="section-134"/>
+    <w:bookmarkEnd w:id="158"/>
+    <w:bookmarkStart w:id="159" w:name="section-134"/>
     <w:p>
       <w:pPr>
         <w:pStyle w:val="Heading3"/>
@@ -7655,8 +7742,8 @@
         <w:t xml:space="preserve">She constantly fanned them at Cannes.</w:t>
       </w:r>
     </w:p>
-    <w:bookmarkEnd w:id="156"/>
-    <w:bookmarkStart w:id="157" w:name="section-135"/>
+    <w:bookmarkEnd w:id="159"/>
+    <w:bookmarkStart w:id="160" w:name="section-135"/>
     <w:p>
       <w:pPr>
         <w:pStyle w:val="Heading3"/>
@@ -7706,8 +7793,8 @@
         <w:t xml:space="preserve">And perceived two fat ducks of Cashmere.</w:t>
       </w:r>
     </w:p>
-    <w:bookmarkEnd w:id="157"/>
-    <w:bookmarkStart w:id="158" w:name="section-136"/>
+    <w:bookmarkEnd w:id="160"/>
+    <w:bookmarkStart w:id="161" w:name="section-136"/>
     <w:p>
       <w:pPr>
         <w:pStyle w:val="Heading3"/>
@@ -7757,8 +7844,8 @@
         <w:t xml:space="preserve">Which choked that old person of Florence.</w:t>
       </w:r>
     </w:p>
-    <w:bookmarkEnd w:id="158"/>
-    <w:bookmarkStart w:id="159" w:name="section-137"/>
+    <w:bookmarkEnd w:id="161"/>
+    <w:bookmarkStart w:id="162" w:name="section-137"/>
     <w:p>
       <w:pPr>
         <w:pStyle w:val="Heading3"/>
@@ -7808,8 +7895,8 @@
         <w:t xml:space="preserve">Round the walls of the city of Pisa.</w:t>
       </w:r>
     </w:p>
-    <w:bookmarkEnd w:id="159"/>
-    <w:bookmarkStart w:id="160" w:name="section-138"/>
+    <w:bookmarkEnd w:id="162"/>
+    <w:bookmarkStart w:id="163" w:name="section-138"/>
     <w:p>
       <w:pPr>
         <w:pStyle w:val="Heading3"/>
@@ -7859,8 +7946,8 @@
         <w:t xml:space="preserve">That placid old person of Sheen.</w:t>
       </w:r>
     </w:p>
-    <w:bookmarkEnd w:id="160"/>
-    <w:bookmarkStart w:id="161" w:name="section-139"/>
+    <w:bookmarkEnd w:id="163"/>
+    <w:bookmarkStart w:id="164" w:name="section-139"/>
     <w:p>
       <w:pPr>
         <w:pStyle w:val="Heading3"/>
@@ -7910,8 +7997,8 @@
         <w:t xml:space="preserve">“You propitious old person of Janina!”</w:t>
       </w:r>
     </w:p>
-    <w:bookmarkEnd w:id="161"/>
-    <w:bookmarkStart w:id="162" w:name="section-140"/>
+    <w:bookmarkEnd w:id="164"/>
+    <w:bookmarkStart w:id="165" w:name="section-140"/>
     <w:p>
       <w:pPr>
         <w:pStyle w:val="Heading3"/>
@@ -7961,8 +8048,8 @@
         <w:t xml:space="preserve">That doubtful old man of Spithead.</w:t>
       </w:r>
     </w:p>
-    <w:bookmarkEnd w:id="162"/>
-    <w:bookmarkStart w:id="163" w:name="section-141"/>
+    <w:bookmarkEnd w:id="165"/>
+    <w:bookmarkStart w:id="166" w:name="section-141"/>
     <w:p>
       <w:pPr>
         <w:pStyle w:val="Heading3"/>
@@ -8012,8 +8099,8 @@
         <w:t xml:space="preserve">And delighted the people of Filey.</w:t>
       </w:r>
     </w:p>
-    <w:bookmarkEnd w:id="163"/>
-    <w:bookmarkStart w:id="164" w:name="section-142"/>
+    <w:bookmarkEnd w:id="166"/>
+    <w:bookmarkStart w:id="167" w:name="section-142"/>
     <w:p>
       <w:pPr>
         <w:pStyle w:val="Heading3"/>
@@ -8063,8 +8150,8 @@
         <w:t xml:space="preserve">It will certainly soothe your remorse!”</w:t>
       </w:r>
     </w:p>
-    <w:bookmarkEnd w:id="164"/>
-    <w:bookmarkStart w:id="165" w:name="section-143"/>
+    <w:bookmarkEnd w:id="167"/>
+    <w:bookmarkStart w:id="168" w:name="section-143"/>
     <w:p>
       <w:pPr>
         <w:pStyle w:val="Heading3"/>
@@ -8114,8 +8201,8 @@
         <w:t xml:space="preserve">You disgusting old man of Ibreem!”</w:t>
       </w:r>
     </w:p>
-    <w:bookmarkEnd w:id="165"/>
-    <w:bookmarkStart w:id="166" w:name="section-144"/>
+    <w:bookmarkEnd w:id="168"/>
+    <w:bookmarkStart w:id="169" w:name="section-144"/>
     <w:p>
       <w:pPr>
         <w:pStyle w:val="Heading3"/>
@@ -8165,8 +8252,8 @@
         <w:t xml:space="preserve">Within twenty miles’ distance of Newry.</w:t>
       </w:r>
     </w:p>
-    <w:bookmarkEnd w:id="166"/>
-    <w:bookmarkStart w:id="167" w:name="section-145"/>
+    <w:bookmarkEnd w:id="169"/>
+    <w:bookmarkStart w:id="170" w:name="section-145"/>
     <w:p>
       <w:pPr>
         <w:pStyle w:val="Heading3"/>
@@ -8216,8 +8303,8 @@
         <w:t xml:space="preserve">To request you won’t stay in Dumblane?”</w:t>
       </w:r>
     </w:p>
-    <w:bookmarkEnd w:id="167"/>
-    <w:bookmarkStart w:id="168" w:name="section-146"/>
+    <w:bookmarkEnd w:id="170"/>
+    <w:bookmarkStart w:id="171" w:name="section-146"/>
     <w:p>
       <w:pPr>
         <w:pStyle w:val="Heading3"/>
@@ -8267,8 +8354,8 @@
         <w:t xml:space="preserve">That eclectic old man of Port Grigor.</w:t>
       </w:r>
     </w:p>
-    <w:bookmarkEnd w:id="168"/>
-    <w:bookmarkStart w:id="169" w:name="section-147"/>
+    <w:bookmarkEnd w:id="171"/>
+    <w:bookmarkStart w:id="172" w:name="section-147"/>
     <w:p>
       <w:pPr>
         <w:pStyle w:val="Heading3"/>
@@ -8318,8 +8405,8 @@
         <w:t xml:space="preserve">You obnoxious old person of Sark!”</w:t>
       </w:r>
     </w:p>
-    <w:bookmarkEnd w:id="169"/>
-    <w:bookmarkStart w:id="170" w:name="section-148"/>
+    <w:bookmarkEnd w:id="172"/>
+    <w:bookmarkStart w:id="173" w:name="section-148"/>
     <w:p>
       <w:pPr>
         <w:pStyle w:val="Heading3"/>
@@ -8369,8 +8456,8 @@
         <w:t xml:space="preserve">You luminous person of Barnes!”</w:t>
       </w:r>
     </w:p>
-    <w:bookmarkEnd w:id="170"/>
-    <w:bookmarkStart w:id="171" w:name="section-149"/>
+    <w:bookmarkEnd w:id="173"/>
+    <w:bookmarkStart w:id="174" w:name="section-149"/>
     <w:p>
       <w:pPr>
         <w:pStyle w:val="Heading3"/>
@@ -8420,8 +8507,8 @@
         <w:t xml:space="preserve">Which pleased that old person in gray.</w:t>
       </w:r>
     </w:p>
-    <w:bookmarkEnd w:id="171"/>
-    <w:bookmarkStart w:id="172" w:name="section-150"/>
+    <w:bookmarkEnd w:id="174"/>
+    <w:bookmarkStart w:id="175" w:name="section-150"/>
     <w:p>
       <w:pPr>
         <w:pStyle w:val="Heading3"/>
@@ -8471,8 +8558,8 @@
         <w:t xml:space="preserve">That repulsive old person of Sestri.</w:t>
       </w:r>
     </w:p>
-    <w:bookmarkEnd w:id="172"/>
-    <w:bookmarkStart w:id="173" w:name="section-151"/>
+    <w:bookmarkEnd w:id="175"/>
+    <w:bookmarkStart w:id="176" w:name="section-151"/>
     <w:p>
       <w:pPr>
         <w:pStyle w:val="Heading3"/>
@@ -8522,8 +8609,8 @@
         <w:t xml:space="preserve">That lively old person of Blythe.</w:t>
       </w:r>
     </w:p>
-    <w:bookmarkEnd w:id="173"/>
-    <w:bookmarkStart w:id="174" w:name="section-152"/>
+    <w:bookmarkEnd w:id="176"/>
+    <w:bookmarkStart w:id="177" w:name="section-152"/>
     <w:p>
       <w:pPr>
         <w:pStyle w:val="Heading3"/>
@@ -8573,8 +8660,8 @@
         <w:t xml:space="preserve">That exhaustive old Lady of Winchelsea!</w:t>
       </w:r>
     </w:p>
-    <w:bookmarkEnd w:id="174"/>
-    <w:bookmarkStart w:id="175" w:name="section-153"/>
+    <w:bookmarkEnd w:id="177"/>
+    <w:bookmarkStart w:id="178" w:name="section-153"/>
     <w:p>
       <w:pPr>
         <w:pStyle w:val="Heading3"/>
@@ -8633,8 +8720,8 @@
         <w:t xml:space="preserve">Who devoured that Old Man of Leghorn.</w:t>
       </w:r>
     </w:p>
-    <w:bookmarkEnd w:id="175"/>
-    <w:bookmarkStart w:id="176" w:name="section-154"/>
+    <w:bookmarkEnd w:id="178"/>
+    <w:bookmarkStart w:id="179" w:name="section-154"/>
     <w:p>
       <w:pPr>
         <w:pStyle w:val="Heading3"/>
@@ -8693,8 +8780,8 @@
         <w:t xml:space="preserve">Which grieved that Old Man of Bohemia.</w:t>
       </w:r>
     </w:p>
-    <w:bookmarkEnd w:id="176"/>
-    <w:bookmarkStart w:id="177" w:name="section-155"/>
+    <w:bookmarkEnd w:id="179"/>
+    <w:bookmarkStart w:id="180" w:name="section-155"/>
     <w:p>
       <w:pPr>
         <w:pStyle w:val="Heading3"/>
@@ -8753,8 +8840,8 @@
         <w:t xml:space="preserve">That bewildered Old Man of Corfu.</w:t>
       </w:r>
     </w:p>
-    <w:bookmarkEnd w:id="177"/>
-    <w:bookmarkStart w:id="178" w:name="section-156"/>
+    <w:bookmarkEnd w:id="180"/>
+    <w:bookmarkStart w:id="181" w:name="section-156"/>
     <w:p>
       <w:pPr>
         <w:pStyle w:val="Heading3"/>
@@ -8813,8 +8900,8 @@
         <w:t xml:space="preserve">That unlucky Old Person of Ems.</w:t>
       </w:r>
     </w:p>
-    <w:bookmarkEnd w:id="178"/>
-    <w:bookmarkStart w:id="179" w:name="section-157"/>
+    <w:bookmarkEnd w:id="181"/>
+    <w:bookmarkStart w:id="182" w:name="section-157"/>
     <w:p>
       <w:pPr>
         <w:pStyle w:val="Heading3"/>
@@ -8864,8 +8951,8 @@
         <w:t xml:space="preserve">That impulsive Old Person of Stroud.</w:t>
       </w:r>
     </w:p>
-    <w:bookmarkEnd w:id="179"/>
-    <w:bookmarkStart w:id="180" w:name="section-158"/>
+    <w:bookmarkEnd w:id="182"/>
+    <w:bookmarkStart w:id="183" w:name="section-158"/>
     <w:p>
       <w:pPr>
         <w:pStyle w:val="Heading3"/>
@@ -8915,9 +9002,9 @@
         <w:t xml:space="preserve">That horrible person of Cheadle.</w:t>
       </w:r>
     </w:p>
-    <w:bookmarkEnd w:id="180"/>
-    <w:bookmarkEnd w:id="181"/>
-    <w:bookmarkStart w:id="199" w:name="young-ladies-other-characters"/>
+    <w:bookmarkEnd w:id="183"/>
+    <w:bookmarkEnd w:id="184"/>
+    <w:bookmarkStart w:id="202" w:name="young-ladies-other-characters"/>
     <w:p>
       <w:pPr>
         <w:pStyle w:val="Heading2"/>
@@ -8929,7 +9016,7 @@
         <w:t xml:space="preserve">Young Ladies &amp; Other Characters</w:t>
       </w:r>
     </w:p>
-    <w:bookmarkStart w:id="182" w:name="section-159"/>
+    <w:bookmarkStart w:id="185" w:name="section-159"/>
     <w:p>
       <w:pPr>
         <w:pStyle w:val="Heading3"/>
@@ -8979,8 +9066,8 @@
         <w:t xml:space="preserve">And played several tunes with her chin.</w:t>
       </w:r>
     </w:p>
-    <w:bookmarkEnd w:id="182"/>
-    <w:bookmarkStart w:id="183" w:name="section-160"/>
+    <w:bookmarkEnd w:id="185"/>
+    <w:bookmarkStart w:id="186" w:name="section-160"/>
     <w:p>
       <w:pPr>
         <w:pStyle w:val="Heading3"/>
@@ -9030,8 +9117,8 @@
         <w:t xml:space="preserve">This courageous Young Lady of Norway.</w:t>
       </w:r>
     </w:p>
-    <w:bookmarkEnd w:id="183"/>
-    <w:bookmarkStart w:id="184" w:name="section-161"/>
+    <w:bookmarkEnd w:id="186"/>
+    <w:bookmarkStart w:id="187" w:name="section-161"/>
     <w:p>
       <w:pPr>
         <w:pStyle w:val="Heading3"/>
@@ -9081,8 +9168,8 @@
         <w:t xml:space="preserve">That amusing Young Lady of Bute.</w:t>
       </w:r>
     </w:p>
-    <w:bookmarkEnd w:id="184"/>
-    <w:bookmarkStart w:id="185" w:name="section-162"/>
+    <w:bookmarkEnd w:id="187"/>
+    <w:bookmarkStart w:id="188" w:name="section-162"/>
     <w:p>
       <w:pPr>
         <w:pStyle w:val="Heading3"/>
@@ -9132,8 +9219,8 @@
         <w:t xml:space="preserve">That capricious Young Lady of Turkey.</w:t>
       </w:r>
     </w:p>
-    <w:bookmarkEnd w:id="185"/>
-    <w:bookmarkStart w:id="186" w:name="section-163"/>
+    <w:bookmarkEnd w:id="188"/>
+    <w:bookmarkStart w:id="189" w:name="section-163"/>
     <w:p>
       <w:pPr>
         <w:pStyle w:val="Heading3"/>
@@ -9183,8 +9270,8 @@
         <w:t xml:space="preserve">That ombliferous Person of Crete.</w:t>
       </w:r>
     </w:p>
-    <w:bookmarkEnd w:id="186"/>
-    <w:bookmarkStart w:id="187" w:name="section-164"/>
+    <w:bookmarkEnd w:id="189"/>
+    <w:bookmarkStart w:id="190" w:name="section-164"/>
     <w:p>
       <w:pPr>
         <w:pStyle w:val="Heading3"/>
@@ -9234,8 +9321,8 @@
         <w:t xml:space="preserve">That unfortunate Lady of Clare.</w:t>
       </w:r>
     </w:p>
-    <w:bookmarkEnd w:id="187"/>
-    <w:bookmarkStart w:id="188" w:name="section-165"/>
+    <w:bookmarkEnd w:id="190"/>
+    <w:bookmarkStart w:id="191" w:name="section-165"/>
     <w:p>
       <w:pPr>
         <w:pStyle w:val="Heading3"/>
@@ -9285,8 +9372,8 @@
         <w:t xml:space="preserve">And started away in surprise.</w:t>
       </w:r>
     </w:p>
-    <w:bookmarkEnd w:id="188"/>
-    <w:bookmarkStart w:id="189" w:name="section-166"/>
+    <w:bookmarkEnd w:id="191"/>
+    <w:bookmarkStart w:id="192" w:name="section-166"/>
     <w:p>
       <w:pPr>
         <w:pStyle w:val="Heading3"/>
@@ -9336,8 +9423,8 @@
         <w:t xml:space="preserve">Which vexed that young person in pink.</w:t>
       </w:r>
     </w:p>
-    <w:bookmarkEnd w:id="189"/>
-    <w:bookmarkStart w:id="190" w:name="section-167"/>
+    <w:bookmarkEnd w:id="192"/>
+    <w:bookmarkStart w:id="193" w:name="section-167"/>
     <w:p>
       <w:pPr>
         <w:pStyle w:val="Heading3"/>
@@ -9387,8 +9474,8 @@
         <w:t xml:space="preserve">That ungracious young lady in blue.</w:t>
       </w:r>
     </w:p>
-    <w:bookmarkEnd w:id="190"/>
-    <w:bookmarkStart w:id="191" w:name="section-168"/>
+    <w:bookmarkEnd w:id="193"/>
+    <w:bookmarkStart w:id="194" w:name="section-168"/>
     <w:p>
       <w:pPr>
         <w:pStyle w:val="Heading3"/>
@@ -9438,8 +9525,8 @@
         <w:t xml:space="preserve">Which alarmed that young lady of Greenwich.</w:t>
       </w:r>
     </w:p>
-    <w:bookmarkEnd w:id="191"/>
-    <w:bookmarkStart w:id="192" w:name="section-169"/>
+    <w:bookmarkEnd w:id="194"/>
+    <w:bookmarkStart w:id="195" w:name="section-169"/>
     <w:p>
       <w:pPr>
         <w:pStyle w:val="Heading3"/>
@@ -9489,8 +9576,8 @@
         <w:t xml:space="preserve">Which dazzled the people of Ayr.</w:t>
       </w:r>
     </w:p>
-    <w:bookmarkEnd w:id="192"/>
-    <w:bookmarkStart w:id="193" w:name="section-170"/>
+    <w:bookmarkEnd w:id="195"/>
+    <w:bookmarkStart w:id="196" w:name="section-170"/>
     <w:p>
       <w:pPr>
         <w:pStyle w:val="Heading3"/>
@@ -9540,8 +9627,8 @@
         <w:t xml:space="preserve">And composed a small treatise on history.</w:t>
       </w:r>
     </w:p>
-    <w:bookmarkEnd w:id="193"/>
-    <w:bookmarkStart w:id="194" w:name="section-171"/>
+    <w:bookmarkEnd w:id="196"/>
+    <w:bookmarkStart w:id="197" w:name="section-171"/>
     <w:p>
       <w:pPr>
         <w:pStyle w:val="Heading3"/>
@@ -9600,8 +9687,8 @@
         <w:t xml:space="preserve">That provoking Young Lady of Parma.</w:t>
       </w:r>
     </w:p>
-    <w:bookmarkEnd w:id="194"/>
-    <w:bookmarkStart w:id="195" w:name="section-172"/>
+    <w:bookmarkEnd w:id="197"/>
+    <w:bookmarkStart w:id="198" w:name="section-172"/>
     <w:p>
       <w:pPr>
         <w:pStyle w:val="Heading3"/>
@@ -9660,8 +9747,8 @@
         <w:t xml:space="preserve">And enchanted the city of Tyre.</w:t>
       </w:r>
     </w:p>
-    <w:bookmarkEnd w:id="195"/>
-    <w:bookmarkStart w:id="196" w:name="section-173"/>
+    <w:bookmarkEnd w:id="198"/>
+    <w:bookmarkStart w:id="199" w:name="section-173"/>
     <w:p>
       <w:pPr>
         <w:pStyle w:val="Heading3"/>
@@ -9720,8 +9807,8 @@
         <w:t xml:space="preserve">Which distracted that virulent bull.</w:t>
       </w:r>
     </w:p>
-    <w:bookmarkEnd w:id="196"/>
-    <w:bookmarkStart w:id="197" w:name="section-174"/>
+    <w:bookmarkEnd w:id="199"/>
+    <w:bookmarkStart w:id="200" w:name="section-174"/>
     <w:p>
       <w:pPr>
         <w:pStyle w:val="Heading3"/>
@@ -9780,8 +9867,8 @@
         <w:t xml:space="preserve">That accomplished Young Lady of Welling.</w:t>
       </w:r>
     </w:p>
-    <w:bookmarkEnd w:id="197"/>
-    <w:bookmarkStart w:id="198" w:name="section-175"/>
+    <w:bookmarkEnd w:id="200"/>
+    <w:bookmarkStart w:id="201" w:name="section-175"/>
     <w:p>
       <w:pPr>
         <w:pStyle w:val="Heading3"/>
@@ -9840,9 +9927,9 @@
         <w:t xml:space="preserve">As was screamed by that lady of Russia.</w:t>
       </w:r>
     </w:p>
-    <w:bookmarkEnd w:id="198"/>
-    <w:bookmarkEnd w:id="199"/>
-    <w:bookmarkStart w:id="220" w:name="modern-limericks"/>
+    <w:bookmarkEnd w:id="201"/>
+    <w:bookmarkEnd w:id="202"/>
+    <w:bookmarkStart w:id="223" w:name="modern-limericks"/>
     <w:p>
       <w:pPr>
         <w:pStyle w:val="Heading2"/>
@@ -9854,7 +9941,7 @@
         <w:t xml:space="preserve">Modern Limericks</w:t>
       </w:r>
     </w:p>
-    <w:bookmarkStart w:id="203" w:name="phones-apps-online-life"/>
+    <w:bookmarkStart w:id="206" w:name="phones-apps-online-life"/>
     <w:p>
       <w:pPr>
         <w:pStyle w:val="Heading3"/>
@@ -9875,18 +9962,18 @@
           <wp:inline>
             <wp:extent cx="2743200" cy="4114799"/>
             <wp:effectExtent b="0" l="0" r="0" t="0"/>
-            <wp:docPr descr="A smartphone frames a moonlit selfie that has erased its subject." title="" id="201" name="Picture"/>
+            <wp:docPr descr="A smartphone frames a moonlit selfie that has erased its subject." title="" id="204" name="Picture"/>
             <a:graphic>
               <a:graphicData uri="http://schemas.openxmlformats.org/drawingml/2006/picture">
                 <pic:pic>
                   <pic:nvPicPr>
-                    <pic:cNvPr descr="images/09_selfie_filter.jpg" id="202" name="Picture"/>
+                    <pic:cNvPr descr="images/09_selfie_filter.jpg" id="205" name="Picture"/>
                     <pic:cNvPicPr>
                       <a:picLocks noChangeArrowheads="1" noChangeAspect="1"/>
                     </pic:cNvPicPr>
                   </pic:nvPicPr>
                   <pic:blipFill>
-                    <a:blip r:embed="rId200"/>
+                    <a:blip r:embed="rId203"/>
                     <a:stretch>
                       <a:fillRect/>
                     </a:stretch>
@@ -10159,8 +10246,8 @@
         <w:t xml:space="preserve">And left me alone with the moon.</w:t>
       </w:r>
     </w:p>
-    <w:bookmarkEnd w:id="203"/>
-    <w:bookmarkStart w:id="207" w:name="work-meetings-remote-life"/>
+    <w:bookmarkEnd w:id="206"/>
+    <w:bookmarkStart w:id="210" w:name="work-meetings-remote-life"/>
     <w:p>
       <w:pPr>
         <w:pStyle w:val="Heading3"/>
@@ -10181,18 +10268,18 @@
           <wp:inline>
             <wp:extent cx="2743200" cy="4114799"/>
             <wp:effectExtent b="0" l="0" r="0" t="0"/>
-            <wp:docPr descr="A remote worker falls asleep at a laptop while a pillow takes the call." title="" id="205" name="Picture"/>
+            <wp:docPr descr="A remote worker falls asleep at a laptop while a pillow takes the call." title="" id="208" name="Picture"/>
             <a:graphic>
               <a:graphicData uri="http://schemas.openxmlformats.org/drawingml/2006/picture">
                 <pic:pic>
                   <pic:nvPicPr>
-                    <pic:cNvPr descr="images/05_remote_work_pillow.jpg" id="206" name="Picture"/>
+                    <pic:cNvPr descr="images/05_remote_work_pillow.jpg" id="209" name="Picture"/>
                     <pic:cNvPicPr>
                       <a:picLocks noChangeArrowheads="1" noChangeAspect="1"/>
                     </pic:cNvPicPr>
                   </pic:nvPicPr>
                   <pic:blipFill>
-                    <a:blip r:embed="rId204"/>
+                    <a:blip r:embed="rId207"/>
                     <a:stretch>
                       <a:fillRect/>
                     </a:stretch>
@@ -10465,8 +10552,8 @@
         <w:t xml:space="preserve">And added a call about cake.</w:t>
       </w:r>
     </w:p>
-    <w:bookmarkEnd w:id="207"/>
-    <w:bookmarkStart w:id="208" w:name="streaming-games-cloud-life"/>
+    <w:bookmarkEnd w:id="210"/>
+    <w:bookmarkStart w:id="211" w:name="streaming-games-cloud-life"/>
     <w:p>
       <w:pPr>
         <w:pStyle w:val="Heading3"/>
@@ -10713,8 +10800,8 @@
         <w:t xml:space="preserve">Won a race without him in sight.</w:t>
       </w:r>
     </w:p>
-    <w:bookmarkEnd w:id="208"/>
-    <w:bookmarkStart w:id="212" w:name="chatbots-smart-devices"/>
+    <w:bookmarkEnd w:id="211"/>
+    <w:bookmarkStart w:id="215" w:name="chatbots-smart-devices"/>
     <w:p>
       <w:pPr>
         <w:pStyle w:val="Heading3"/>
@@ -10735,18 +10822,18 @@
           <wp:inline>
             <wp:extent cx="2743200" cy="4114799"/>
             <wp:effectExtent b="0" l="0" r="0" t="0"/>
-            <wp:docPr descr="A cat sleeps on a charger beside a helpful chatbot and a smart speaker." title="" id="210" name="Picture"/>
+            <wp:docPr descr="A cat sleeps on a charger beside a helpful chatbot and a smart speaker." title="" id="213" name="Picture"/>
             <a:graphic>
               <a:graphicData uri="http://schemas.openxmlformats.org/drawingml/2006/picture">
                 <pic:pic>
                   <pic:nvPicPr>
-                    <pic:cNvPr descr="images/10_chatbot_at_desk.jpg" id="211" name="Picture"/>
+                    <pic:cNvPr descr="images/10_chatbot_at_desk.jpg" id="214" name="Picture"/>
                     <pic:cNvPicPr>
                       <a:picLocks noChangeArrowheads="1" noChangeAspect="1"/>
                     </pic:cNvPicPr>
                   </pic:nvPicPr>
                   <pic:blipFill>
-                    <a:blip r:embed="rId209"/>
+                    <a:blip r:embed="rId212"/>
                     <a:stretch>
                       <a:fillRect/>
                     </a:stretch>
@@ -10972,8 +11059,8 @@
         <w:t xml:space="preserve">Then turned on the porch light to spite.</w:t>
       </w:r>
     </w:p>
-    <w:bookmarkEnd w:id="212"/>
-    <w:bookmarkStart w:id="219" w:name="travel-cars-delivery-drones"/>
+    <w:bookmarkEnd w:id="215"/>
+    <w:bookmarkStart w:id="222" w:name="travel-cars-delivery-drones"/>
     <w:p>
       <w:pPr>
         <w:pStyle w:val="Heading3"/>
@@ -10994,70 +11081,12 @@
           <wp:inline>
             <wp:extent cx="2743200" cy="4114799"/>
             <wp:effectExtent b="0" l="0" r="0" t="0"/>
-            <wp:docPr descr="A drone carrying noodles tangles with a rooftop weather vane." title="" id="214" name="Picture"/>
+            <wp:docPr descr="A drone carrying noodles tangles with a rooftop weather vane." title="" id="217" name="Picture"/>
             <a:graphic>
               <a:graphicData uri="http://schemas.openxmlformats.org/drawingml/2006/picture">
                 <pic:pic>
                   <pic:nvPicPr>
-                    <pic:cNvPr descr="images/07_drone_noodle_delivery.jpg" id="215" name="Picture"/>
-                    <pic:cNvPicPr>
-                      <a:picLocks noChangeArrowheads="1" noChangeAspect="1"/>
-                    </pic:cNvPicPr>
-                  </pic:nvPicPr>
-                  <pic:blipFill>
-                    <a:blip r:embed="rId213"/>
-                    <a:stretch>
-                      <a:fillRect/>
-                    </a:stretch>
-                  </pic:blipFill>
-                  <pic:spPr bwMode="auto">
-                    <a:xfrm>
-                      <a:off x="0" y="0"/>
-                      <a:ext cx="2743200" cy="4114799"/>
-                    </a:xfrm>
-                    <a:prstGeom prst="rect">
-                      <a:avLst/>
-                    </a:prstGeom>
-                    <a:noFill/>
-                    <a:ln w="9525">
-                      <a:noFill/>
-                      <a:headEnd/>
-                      <a:tailEnd/>
-                    </a:ln>
-                  </pic:spPr>
-                </pic:pic>
-              </a:graphicData>
-            </a:graphic>
-          </wp:inline>
-        </w:drawing>
-      </w:r>
-      <w:r>
-        <w:br/>
-      </w:r>
-      <w:r>
-        <w:rPr>
-          <w:i/>
-          <w:iCs/>
-          <w:lang w:val="en-US"/>
-        </w:rPr>
-        <w:t xml:space="preserve">The delivery route takes a turn.</w:t>
-      </w:r>
-    </w:p>
-    <w:p>
-      <w:pPr>
-        <w:pStyle w:val="BodyText"/>
-      </w:pPr>
-      <w:r>
-        <w:drawing>
-          <wp:inline>
-            <wp:extent cx="2743200" cy="4114799"/>
-            <wp:effectExtent b="0" l="0" r="0" t="0"/>
-            <wp:docPr descr="An electric car stops beside a charger with a nearly empty battery." title="" id="217" name="Picture"/>
-            <a:graphic>
-              <a:graphicData uri="http://schemas.openxmlformats.org/drawingml/2006/picture">
-                <pic:pic>
-                  <pic:nvPicPr>
-                    <pic:cNvPr descr="images/08_electric_car.jpg" id="218" name="Picture"/>
+                    <pic:cNvPr descr="images/07_drone_noodle_delivery.jpg" id="218" name="Picture"/>
                     <pic:cNvPicPr>
                       <a:picLocks noChangeArrowheads="1" noChangeAspect="1"/>
                     </pic:cNvPicPr>
@@ -11098,185 +11127,30 @@
           <w:iCs/>
           <w:lang w:val="en-US"/>
         </w:rPr>
-        <w:t xml:space="preserve">Range anxiety in the village square.</w:t>
+        <w:t xml:space="preserve">The delivery route takes a turn.</w:t>
       </w:r>
     </w:p>
     <w:p>
       <w:pPr>
         <w:pStyle w:val="BodyText"/>
-      </w:pPr>
-      <w:r>
-        <w:rPr>
-          <w:lang w:val="en-US"/>
-        </w:rPr>
-        <w:t xml:space="preserve">A GPS sent us to sea,</w:t>
-      </w:r>
-      <w:r>
-        <w:br/>
-      </w:r>
-      <w:r>
-        <w:rPr>
-          <w:lang w:val="en-US"/>
-        </w:rPr>
-        <w:t xml:space="preserve">Past the highway, the pier, and the quay.</w:t>
-      </w:r>
-      <w:r>
-        <w:br/>
-      </w:r>
-      <w:r>
-        <w:rPr>
-          <w:lang w:val="en-US"/>
-        </w:rPr>
-        <w:t xml:space="preserve">When we asked for a route,</w:t>
-      </w:r>
-      <w:r>
-        <w:br/>
-      </w:r>
-      <w:r>
-        <w:rPr>
-          <w:lang w:val="en-US"/>
-        </w:rPr>
-        <w:t xml:space="preserve">It calmly said, “Out—</w:t>
-      </w:r>
-      <w:r>
-        <w:br/>
-      </w:r>
-      <w:r>
-        <w:rPr>
-          <w:lang w:val="en-US"/>
-        </w:rPr>
-        <w:t xml:space="preserve">The next turn is somewhere in the sea.”</w:t>
-      </w:r>
-    </w:p>
-    <w:p>
-      <w:pPr>
-        <w:pStyle w:val="BodyText"/>
-      </w:pPr>
-      <w:r>
-        <w:rPr>
-          <w:lang w:val="en-US"/>
-        </w:rPr>
-        <w:t xml:space="preserve">My electric car, full of pride,</w:t>
-      </w:r>
-      <w:r>
-        <w:br/>
-      </w:r>
-      <w:r>
-        <w:rPr>
-          <w:lang w:val="en-US"/>
-        </w:rPr>
-        <w:t xml:space="preserve">Said, “No charging is needed,” and sighed.</w:t>
-      </w:r>
-      <w:r>
-        <w:br/>
-      </w:r>
-      <w:r>
-        <w:rPr>
-          <w:lang w:val="en-US"/>
-        </w:rPr>
-        <w:t xml:space="preserve">“I’ve range to spare!”</w:t>
-      </w:r>
-      <w:r>
-        <w:br/>
-      </w:r>
-      <w:r>
-        <w:rPr>
-          <w:lang w:val="en-US"/>
-        </w:rPr>
-        <w:t xml:space="preserve">It stalled in the square—</w:t>
-      </w:r>
-      <w:r>
-        <w:br/>
-      </w:r>
-      <w:r>
-        <w:rPr>
-          <w:lang w:val="en-US"/>
-        </w:rPr>
-        <w:t xml:space="preserve">With a charger in sight just outside.</w:t>
-      </w:r>
-    </w:p>
-    <w:p>
-      <w:pPr>
-        <w:pStyle w:val="BodyText"/>
-      </w:pPr>
-      <w:r>
-        <w:rPr>
-          <w:lang w:val="en-US"/>
-        </w:rPr>
-        <w:t xml:space="preserve">A drone brought my noodles at noon,</w:t>
-      </w:r>
-      <w:r>
-        <w:br/>
-      </w:r>
-      <w:r>
-        <w:rPr>
-          <w:lang w:val="en-US"/>
-        </w:rPr>
-        <w:t xml:space="preserve">Then circled my roof like a loon.</w:t>
-      </w:r>
-      <w:r>
-        <w:br/>
-      </w:r>
-      <w:r>
-        <w:rPr>
-          <w:lang w:val="en-US"/>
-        </w:rPr>
-        <w:t xml:space="preserve">It lowered the bag,</w:t>
-      </w:r>
-      <w:r>
-        <w:br/>
-      </w:r>
-      <w:r>
-        <w:rPr>
-          <w:lang w:val="en-US"/>
-        </w:rPr>
-        <w:t xml:space="preserve">But snagged on a flag—</w:t>
-      </w:r>
-      <w:r>
-        <w:br/>
-      </w:r>
-      <w:r>
-        <w:rPr>
-          <w:lang w:val="en-US"/>
-        </w:rPr>
-        <w:t xml:space="preserve">And delivered my lunch to the moon.</w:t>
-      </w:r>
-    </w:p>
-    <w:bookmarkEnd w:id="219"/>
-    <w:bookmarkEnd w:id="220"/>
-    <w:bookmarkStart w:id="236" w:name="longer-nonsense-rhymes"/>
-    <w:p>
-      <w:pPr>
-        <w:pStyle w:val="Heading2"/>
-      </w:pPr>
-      <w:r>
-        <w:rPr>
-          <w:lang w:val="en-US"/>
-        </w:rPr>
-        <w:t xml:space="preserve">Longer Nonsense Rhymes</w:t>
-      </w:r>
-    </w:p>
-    <w:p>
-      <w:pPr>
-        <w:pStyle w:val="FirstParagraph"/>
       </w:pPr>
       <w:r>
         <w:drawing>
           <wp:inline>
             <wp:extent cx="2743200" cy="4114799"/>
             <wp:effectExtent b="0" l="0" r="0" t="0"/>
-            <wp:docPr descr="An owl and cat sail beneath the moon with a pig carrying a ring." title="" id="222" name="Picture"/>
+            <wp:docPr descr="An electric car stops beside a charger with a nearly empty battery." title="" id="220" name="Picture"/>
             <a:graphic>
               <a:graphicData uri="http://schemas.openxmlformats.org/drawingml/2006/picture">
                 <pic:pic>
                   <pic:nvPicPr>
-                    <pic:cNvPr descr="images/11_owl_pussycat_new.jpg" id="223" name="Picture"/>
+                    <pic:cNvPr descr="images/08_electric_car.jpg" id="221" name="Picture"/>
                     <pic:cNvPicPr>
                       <a:picLocks noChangeArrowheads="1" noChangeAspect="1"/>
                     </pic:cNvPicPr>
                   </pic:nvPicPr>
                   <pic:blipFill>
-                    <a:blip r:embed="rId221"/>
+                    <a:blip r:embed="rId219"/>
                     <a:stretch>
                       <a:fillRect/>
                     </a:stretch>
@@ -11311,19 +11185,162 @@
           <w:iCs/>
           <w:lang w:val="en-US"/>
         </w:rPr>
-        <w:t xml:space="preserve">A moonlit voyage with unusual company.</w:t>
-      </w:r>
-    </w:p>
-    <w:bookmarkStart w:id="227" w:name="the-owl-and-the-pussy-cat"/>
-    <w:p>
-      <w:pPr>
-        <w:pStyle w:val="Heading3"/>
-      </w:pPr>
-      <w:r>
-        <w:rPr>
-          <w:lang w:val="en-US"/>
-        </w:rPr>
-        <w:t xml:space="preserve">The Owl and the Pussy-Cat</w:t>
+        <w:t xml:space="preserve">Range anxiety in the village square.</w:t>
+      </w:r>
+    </w:p>
+    <w:p>
+      <w:pPr>
+        <w:pStyle w:val="BodyText"/>
+      </w:pPr>
+      <w:r>
+        <w:rPr>
+          <w:lang w:val="en-US"/>
+        </w:rPr>
+        <w:t xml:space="preserve">A GPS sent us to sea,</w:t>
+      </w:r>
+      <w:r>
+        <w:br/>
+      </w:r>
+      <w:r>
+        <w:rPr>
+          <w:lang w:val="en-US"/>
+        </w:rPr>
+        <w:t xml:space="preserve">Past the highway, the pier, and the quay.</w:t>
+      </w:r>
+      <w:r>
+        <w:br/>
+      </w:r>
+      <w:r>
+        <w:rPr>
+          <w:lang w:val="en-US"/>
+        </w:rPr>
+        <w:t xml:space="preserve">When we asked for a route,</w:t>
+      </w:r>
+      <w:r>
+        <w:br/>
+      </w:r>
+      <w:r>
+        <w:rPr>
+          <w:lang w:val="en-US"/>
+        </w:rPr>
+        <w:t xml:space="preserve">It calmly said, “Out—</w:t>
+      </w:r>
+      <w:r>
+        <w:br/>
+      </w:r>
+      <w:r>
+        <w:rPr>
+          <w:lang w:val="en-US"/>
+        </w:rPr>
+        <w:t xml:space="preserve">The next turn is somewhere in the sea.”</w:t>
+      </w:r>
+    </w:p>
+    <w:p>
+      <w:pPr>
+        <w:pStyle w:val="BodyText"/>
+      </w:pPr>
+      <w:r>
+        <w:rPr>
+          <w:lang w:val="en-US"/>
+        </w:rPr>
+        <w:t xml:space="preserve">My electric car, full of pride,</w:t>
+      </w:r>
+      <w:r>
+        <w:br/>
+      </w:r>
+      <w:r>
+        <w:rPr>
+          <w:lang w:val="en-US"/>
+        </w:rPr>
+        <w:t xml:space="preserve">Said, “No charging is needed,” and sighed.</w:t>
+      </w:r>
+      <w:r>
+        <w:br/>
+      </w:r>
+      <w:r>
+        <w:rPr>
+          <w:lang w:val="en-US"/>
+        </w:rPr>
+        <w:t xml:space="preserve">“I’ve range to spare!”</w:t>
+      </w:r>
+      <w:r>
+        <w:br/>
+      </w:r>
+      <w:r>
+        <w:rPr>
+          <w:lang w:val="en-US"/>
+        </w:rPr>
+        <w:t xml:space="preserve">It stalled in the square—</w:t>
+      </w:r>
+      <w:r>
+        <w:br/>
+      </w:r>
+      <w:r>
+        <w:rPr>
+          <w:lang w:val="en-US"/>
+        </w:rPr>
+        <w:t xml:space="preserve">With a charger in sight just outside.</w:t>
+      </w:r>
+    </w:p>
+    <w:p>
+      <w:pPr>
+        <w:pStyle w:val="BodyText"/>
+      </w:pPr>
+      <w:r>
+        <w:rPr>
+          <w:lang w:val="en-US"/>
+        </w:rPr>
+        <w:t xml:space="preserve">A drone brought my noodles at noon,</w:t>
+      </w:r>
+      <w:r>
+        <w:br/>
+      </w:r>
+      <w:r>
+        <w:rPr>
+          <w:lang w:val="en-US"/>
+        </w:rPr>
+        <w:t xml:space="preserve">Then circled my roof like a loon.</w:t>
+      </w:r>
+      <w:r>
+        <w:br/>
+      </w:r>
+      <w:r>
+        <w:rPr>
+          <w:lang w:val="en-US"/>
+        </w:rPr>
+        <w:t xml:space="preserve">It lowered the bag,</w:t>
+      </w:r>
+      <w:r>
+        <w:br/>
+      </w:r>
+      <w:r>
+        <w:rPr>
+          <w:lang w:val="en-US"/>
+        </w:rPr>
+        <w:t xml:space="preserve">But snagged on a flag—</w:t>
+      </w:r>
+      <w:r>
+        <w:br/>
+      </w:r>
+      <w:r>
+        <w:rPr>
+          <w:lang w:val="en-US"/>
+        </w:rPr>
+        <w:t xml:space="preserve">And delivered my lunch to the moon.</w:t>
+      </w:r>
+    </w:p>
+    <w:bookmarkEnd w:id="222"/>
+    <w:bookmarkEnd w:id="223"/>
+    <w:bookmarkStart w:id="239" w:name="longer-nonsense-rhymes"/>
+    <w:p>
+      <w:pPr>
+        <w:pStyle w:val="Heading2"/>
+      </w:pPr>
+      <w:r>
+        <w:rPr>
+          <w:lang w:val="en-US"/>
+        </w:rPr>
+        <w:t xml:space="preserve">Longer Nonsense Rhymes</w:t>
       </w:r>
     </w:p>
     <w:p>
@@ -11340,7 +11357,7 @@
               <a:graphicData uri="http://schemas.openxmlformats.org/drawingml/2006/picture">
                 <pic:pic>
                   <pic:nvPicPr>
-                    <pic:cNvPr descr="images/02_owl_and_pussycat.jpg" id="226" name="Picture"/>
+                    <pic:cNvPr descr="images/11_owl_pussycat_new.jpg" id="226" name="Picture"/>
                     <pic:cNvPicPr>
                       <a:picLocks noChangeArrowheads="1" noChangeAspect="1"/>
                     </pic:cNvPicPr>
@@ -11381,314 +11398,10 @@
           <w:iCs/>
           <w:lang w:val="en-US"/>
         </w:rPr>
-        <w:t xml:space="preserve">A moonlit proposal at sea.</w:t>
-      </w:r>
-    </w:p>
-    <w:p>
-      <w:pPr>
-        <w:pStyle w:val="BodyText"/>
-      </w:pPr>
-      <w:r>
-        <w:rPr>
-          <w:lang w:val="en-US"/>
-        </w:rPr>
-        <w:t xml:space="preserve">The Owl and the Pussy-Cat went to sea</w:t>
-      </w:r>
-      <w:r>
-        <w:br/>
-      </w:r>
-      <w:r>
-        <w:rPr>
-          <w:lang w:val="en-US"/>
-        </w:rPr>
-        <w:t xml:space="preserve">In a beautiful pea-green boat,</w:t>
-      </w:r>
-      <w:r>
-        <w:br/>
-      </w:r>
-      <w:r>
-        <w:rPr>
-          <w:lang w:val="en-US"/>
-        </w:rPr>
-        <w:t xml:space="preserve">They took some honey, and plenty of money,</w:t>
-      </w:r>
-      <w:r>
-        <w:br/>
-      </w:r>
-      <w:r>
-        <w:rPr>
-          <w:lang w:val="en-US"/>
-        </w:rPr>
-        <w:t xml:space="preserve">Wrapped up in a five-pound note.</w:t>
-      </w:r>
-      <w:r>
-        <w:br/>
-      </w:r>
-      <w:r>
-        <w:rPr>
-          <w:lang w:val="en-US"/>
-        </w:rPr>
-        <w:t xml:space="preserve">The Owl looked up to the stars above,</w:t>
-      </w:r>
-      <w:r>
-        <w:br/>
-      </w:r>
-      <w:r>
-        <w:rPr>
-          <w:lang w:val="en-US"/>
-        </w:rPr>
-        <w:t xml:space="preserve">And sang to a small guitar,</w:t>
-      </w:r>
-      <w:r>
-        <w:br/>
-      </w:r>
-      <w:r>
-        <w:rPr>
-          <w:lang w:val="en-US"/>
-        </w:rPr>
-        <w:t xml:space="preserve">“O lovely Pussy! O Pussy, my love,</w:t>
-      </w:r>
-      <w:r>
-        <w:br/>
-      </w:r>
-      <w:r>
-        <w:rPr>
-          <w:lang w:val="en-US"/>
-        </w:rPr>
-        <w:t xml:space="preserve">What a beautiful Pussy you are,</w:t>
-      </w:r>
-      <w:r>
-        <w:br/>
-      </w:r>
-      <w:r>
-        <w:rPr>
-          <w:lang w:val="en-US"/>
-        </w:rPr>
-        <w:t xml:space="preserve">You are,</w:t>
-      </w:r>
-      <w:r>
-        <w:br/>
-      </w:r>
-      <w:r>
-        <w:rPr>
-          <w:lang w:val="en-US"/>
-        </w:rPr>
-        <w:t xml:space="preserve">You are!</w:t>
-      </w:r>
-      <w:r>
-        <w:br/>
-      </w:r>
-      <w:r>
-        <w:rPr>
-          <w:lang w:val="en-US"/>
-        </w:rPr>
-        <w:t xml:space="preserve">What a beautiful Pussy you are!”</w:t>
-      </w:r>
-    </w:p>
-    <w:p>
-      <w:pPr>
-        <w:pStyle w:val="BodyText"/>
-      </w:pPr>
-      <w:r>
-        <w:rPr>
-          <w:lang w:val="en-US"/>
-        </w:rPr>
-        <w:t xml:space="preserve">Pussy said to the Owl, “You elegant fowl!</w:t>
-      </w:r>
-      <w:r>
-        <w:br/>
-      </w:r>
-      <w:r>
-        <w:rPr>
-          <w:lang w:val="en-US"/>
-        </w:rPr>
-        <w:t xml:space="preserve">How charmingly sweet you sing!</w:t>
-      </w:r>
-      <w:r>
-        <w:br/>
-      </w:r>
-      <w:r>
-        <w:rPr>
-          <w:lang w:val="en-US"/>
-        </w:rPr>
-        <w:t xml:space="preserve">O let us be married! too long we have tarried:</w:t>
-      </w:r>
-      <w:r>
-        <w:br/>
-      </w:r>
-      <w:r>
-        <w:rPr>
-          <w:lang w:val="en-US"/>
-        </w:rPr>
-        <w:t xml:space="preserve">But what shall we do for a ring?”</w:t>
-      </w:r>
-      <w:r>
-        <w:br/>
-      </w:r>
-      <w:r>
-        <w:rPr>
-          <w:lang w:val="en-US"/>
-        </w:rPr>
-        <w:t xml:space="preserve">They sailed away for a year and a day,</w:t>
-      </w:r>
-      <w:r>
-        <w:br/>
-      </w:r>
-      <w:r>
-        <w:rPr>
-          <w:lang w:val="en-US"/>
-        </w:rPr>
-        <w:t xml:space="preserve">To the land where the Bong-tree grows,</w:t>
-      </w:r>
-      <w:r>
-        <w:br/>
-      </w:r>
-      <w:r>
-        <w:rPr>
-          <w:lang w:val="en-US"/>
-        </w:rPr>
-        <w:t xml:space="preserve">And there in a wood a Piggy-wig stood,</w:t>
-      </w:r>
-      <w:r>
-        <w:br/>
-      </w:r>
-      <w:r>
-        <w:rPr>
-          <w:lang w:val="en-US"/>
-        </w:rPr>
-        <w:t xml:space="preserve">With a ring at the end of his nose,</w:t>
-      </w:r>
-      <w:r>
-        <w:br/>
-      </w:r>
-      <w:r>
-        <w:rPr>
-          <w:lang w:val="en-US"/>
-        </w:rPr>
-        <w:t xml:space="preserve">His nose,</w:t>
-      </w:r>
-      <w:r>
-        <w:br/>
-      </w:r>
-      <w:r>
-        <w:rPr>
-          <w:lang w:val="en-US"/>
-        </w:rPr>
-        <w:t xml:space="preserve">His nose,</w:t>
-      </w:r>
-      <w:r>
-        <w:br/>
-      </w:r>
-      <w:r>
-        <w:rPr>
-          <w:lang w:val="en-US"/>
-        </w:rPr>
-        <w:t xml:space="preserve">With a ring at the end of his nose.</w:t>
-      </w:r>
-    </w:p>
-    <w:p>
-      <w:pPr>
-        <w:pStyle w:val="BodyText"/>
-      </w:pPr>
-      <w:r>
-        <w:rPr>
-          <w:lang w:val="en-US"/>
-        </w:rPr>
-        <w:t xml:space="preserve">“Dear Pig, are you willing to sell for one shilling</w:t>
-      </w:r>
-      <w:r>
-        <w:br/>
-      </w:r>
-      <w:r>
-        <w:rPr>
-          <w:lang w:val="en-US"/>
-        </w:rPr>
-        <w:t xml:space="preserve">Your ring?” Said the Piggy, “I will.”</w:t>
-      </w:r>
-      <w:r>
-        <w:br/>
-      </w:r>
-      <w:r>
-        <w:rPr>
-          <w:lang w:val="en-US"/>
-        </w:rPr>
-        <w:t xml:space="preserve">So they took it away, and were married next day</w:t>
-      </w:r>
-      <w:r>
-        <w:br/>
-      </w:r>
-      <w:r>
-        <w:rPr>
-          <w:lang w:val="en-US"/>
-        </w:rPr>
-        <w:t xml:space="preserve">By the Turkey who lives on the hill.</w:t>
-      </w:r>
-      <w:r>
-        <w:br/>
-      </w:r>
-      <w:r>
-        <w:rPr>
-          <w:lang w:val="en-US"/>
-        </w:rPr>
-        <w:t xml:space="preserve">They dined on mince, and slices of quince,</w:t>
-      </w:r>
-      <w:r>
-        <w:br/>
-      </w:r>
-      <w:r>
-        <w:rPr>
-          <w:lang w:val="en-US"/>
-        </w:rPr>
-        <w:t xml:space="preserve">Which they ate with a runcible spoon;</w:t>
-      </w:r>
-      <w:r>
-        <w:br/>
-      </w:r>
-      <w:r>
-        <w:rPr>
-          <w:lang w:val="en-US"/>
-        </w:rPr>
-        <w:t xml:space="preserve">And hand in hand, on the edge of the sand,</w:t>
-      </w:r>
-      <w:r>
-        <w:br/>
-      </w:r>
-      <w:r>
-        <w:rPr>
-          <w:lang w:val="en-US"/>
-        </w:rPr>
-        <w:t xml:space="preserve">They danced by the light of the moon,</w:t>
-      </w:r>
-      <w:r>
-        <w:br/>
-      </w:r>
-      <w:r>
-        <w:rPr>
-          <w:lang w:val="en-US"/>
-        </w:rPr>
-        <w:t xml:space="preserve">The moon,</w:t>
-      </w:r>
-      <w:r>
-        <w:br/>
-      </w:r>
-      <w:r>
-        <w:rPr>
-          <w:lang w:val="en-US"/>
-        </w:rPr>
-        <w:t xml:space="preserve">The moon,</w:t>
-      </w:r>
-      <w:r>
-        <w:br/>
-      </w:r>
-      <w:r>
-        <w:rPr>
-          <w:lang w:val="en-US"/>
-        </w:rPr>
-        <w:t xml:space="preserve">They danced by the light of the moon.</w:t>
-      </w:r>
-    </w:p>
-    <w:bookmarkEnd w:id="227"/>
-    <w:bookmarkStart w:id="231" w:name="the-jumblies"/>
+        <w:t xml:space="preserve">A moonlit voyage with unusual company.</w:t>
+      </w:r>
+    </w:p>
+    <w:bookmarkStart w:id="230" w:name="the-owl-and-the-pussy-cat"/>
     <w:p>
       <w:pPr>
         <w:pStyle w:val="Heading3"/>
@@ -11697,7 +11410,7 @@
         <w:rPr>
           <w:lang w:val="en-US"/>
         </w:rPr>
-        <w:t xml:space="preserve">The Jumblies</w:t>
+        <w:t xml:space="preserve">The Owl and the Pussy-Cat</w:t>
       </w:r>
     </w:p>
     <w:p>
@@ -11709,18 +11422,18 @@
           <wp:inline>
             <wp:extent cx="2743200" cy="4114799"/>
             <wp:effectExtent b="0" l="0" r="0" t="0"/>
-            <wp:docPr descr="The Jumblies set sail in their sieve." title="" id="229" name="Picture"/>
+            <wp:docPr descr="An owl and cat sail beneath the moon with a pig carrying a ring." title="" id="228" name="Picture"/>
             <a:graphic>
               <a:graphicData uri="http://schemas.openxmlformats.org/drawingml/2006/picture">
                 <pic:pic>
                   <pic:nvPicPr>
-                    <pic:cNvPr descr="images/03_jumblies_at_sea.jpg" id="230" name="Picture"/>
+                    <pic:cNvPr descr="images/02_owl_and_pussycat.jpg" id="229" name="Picture"/>
                     <pic:cNvPicPr>
                       <a:picLocks noChangeArrowheads="1" noChangeAspect="1"/>
                     </pic:cNvPicPr>
                   </pic:nvPicPr>
                   <pic:blipFill>
-                    <a:blip r:embed="rId228"/>
+                    <a:blip r:embed="rId227"/>
                     <a:stretch>
                       <a:fillRect/>
                     </a:stretch>
@@ -11755,6 +11468,380 @@
           <w:iCs/>
           <w:lang w:val="en-US"/>
         </w:rPr>
+        <w:t xml:space="preserve">A moonlit proposal at sea.</w:t>
+      </w:r>
+    </w:p>
+    <w:p>
+      <w:pPr>
+        <w:pStyle w:val="BodyText"/>
+      </w:pPr>
+      <w:r>
+        <w:rPr>
+          <w:lang w:val="en-US"/>
+        </w:rPr>
+        <w:t xml:space="preserve">The Owl and the Pussy-Cat went to sea</w:t>
+      </w:r>
+      <w:r>
+        <w:br/>
+      </w:r>
+      <w:r>
+        <w:rPr>
+          <w:lang w:val="en-US"/>
+        </w:rPr>
+        <w:t xml:space="preserve">In a beautiful pea-green boat,</w:t>
+      </w:r>
+      <w:r>
+        <w:br/>
+      </w:r>
+      <w:r>
+        <w:rPr>
+          <w:lang w:val="en-US"/>
+        </w:rPr>
+        <w:t xml:space="preserve">They took some honey, and plenty of money,</w:t>
+      </w:r>
+      <w:r>
+        <w:br/>
+      </w:r>
+      <w:r>
+        <w:rPr>
+          <w:lang w:val="en-US"/>
+        </w:rPr>
+        <w:t xml:space="preserve">Wrapped up in a five-pound note.</w:t>
+      </w:r>
+      <w:r>
+        <w:br/>
+      </w:r>
+      <w:r>
+        <w:rPr>
+          <w:lang w:val="en-US"/>
+        </w:rPr>
+        <w:t xml:space="preserve">The Owl looked up to the stars above,</w:t>
+      </w:r>
+      <w:r>
+        <w:br/>
+      </w:r>
+      <w:r>
+        <w:rPr>
+          <w:lang w:val="en-US"/>
+        </w:rPr>
+        <w:t xml:space="preserve">And sang to a small guitar,</w:t>
+      </w:r>
+      <w:r>
+        <w:br/>
+      </w:r>
+      <w:r>
+        <w:rPr>
+          <w:lang w:val="en-US"/>
+        </w:rPr>
+        <w:t xml:space="preserve">“O lovely Pussy! O Pussy, my love,</w:t>
+      </w:r>
+      <w:r>
+        <w:br/>
+      </w:r>
+      <w:r>
+        <w:rPr>
+          <w:lang w:val="en-US"/>
+        </w:rPr>
+        <w:t xml:space="preserve">What a beautiful Pussy you are,</w:t>
+      </w:r>
+      <w:r>
+        <w:br/>
+      </w:r>
+      <w:r>
+        <w:rPr>
+          <w:lang w:val="en-US"/>
+        </w:rPr>
+        <w:t xml:space="preserve">You are,</w:t>
+      </w:r>
+      <w:r>
+        <w:br/>
+      </w:r>
+      <w:r>
+        <w:rPr>
+          <w:lang w:val="en-US"/>
+        </w:rPr>
+        <w:t xml:space="preserve">You are!</w:t>
+      </w:r>
+      <w:r>
+        <w:br/>
+      </w:r>
+      <w:r>
+        <w:rPr>
+          <w:lang w:val="en-US"/>
+        </w:rPr>
+        <w:t xml:space="preserve">What a beautiful Pussy you are!”</w:t>
+      </w:r>
+    </w:p>
+    <w:p>
+      <w:pPr>
+        <w:pStyle w:val="BodyText"/>
+      </w:pPr>
+      <w:r>
+        <w:rPr>
+          <w:lang w:val="en-US"/>
+        </w:rPr>
+        <w:t xml:space="preserve">Pussy said to the Owl, “You elegant fowl!</w:t>
+      </w:r>
+      <w:r>
+        <w:br/>
+      </w:r>
+      <w:r>
+        <w:rPr>
+          <w:lang w:val="en-US"/>
+        </w:rPr>
+        <w:t xml:space="preserve">How charmingly sweet you sing!</w:t>
+      </w:r>
+      <w:r>
+        <w:br/>
+      </w:r>
+      <w:r>
+        <w:rPr>
+          <w:lang w:val="en-US"/>
+        </w:rPr>
+        <w:t xml:space="preserve">O let us be married! too long we have tarried:</w:t>
+      </w:r>
+      <w:r>
+        <w:br/>
+      </w:r>
+      <w:r>
+        <w:rPr>
+          <w:lang w:val="en-US"/>
+        </w:rPr>
+        <w:t xml:space="preserve">But what shall we do for a ring?”</w:t>
+      </w:r>
+      <w:r>
+        <w:br/>
+      </w:r>
+      <w:r>
+        <w:rPr>
+          <w:lang w:val="en-US"/>
+        </w:rPr>
+        <w:t xml:space="preserve">They sailed away for a year and a day,</w:t>
+      </w:r>
+      <w:r>
+        <w:br/>
+      </w:r>
+      <w:r>
+        <w:rPr>
+          <w:lang w:val="en-US"/>
+        </w:rPr>
+        <w:t xml:space="preserve">To the land where the Bong-tree grows,</w:t>
+      </w:r>
+      <w:r>
+        <w:br/>
+      </w:r>
+      <w:r>
+        <w:rPr>
+          <w:lang w:val="en-US"/>
+        </w:rPr>
+        <w:t xml:space="preserve">And there in a wood a Piggy-wig stood,</w:t>
+      </w:r>
+      <w:r>
+        <w:br/>
+      </w:r>
+      <w:r>
+        <w:rPr>
+          <w:lang w:val="en-US"/>
+        </w:rPr>
+        <w:t xml:space="preserve">With a ring at the end of his nose,</w:t>
+      </w:r>
+      <w:r>
+        <w:br/>
+      </w:r>
+      <w:r>
+        <w:rPr>
+          <w:lang w:val="en-US"/>
+        </w:rPr>
+        <w:t xml:space="preserve">His nose,</w:t>
+      </w:r>
+      <w:r>
+        <w:br/>
+      </w:r>
+      <w:r>
+        <w:rPr>
+          <w:lang w:val="en-US"/>
+        </w:rPr>
+        <w:t xml:space="preserve">His nose,</w:t>
+      </w:r>
+      <w:r>
+        <w:br/>
+      </w:r>
+      <w:r>
+        <w:rPr>
+          <w:lang w:val="en-US"/>
+        </w:rPr>
+        <w:t xml:space="preserve">With a ring at the end of his nose.</w:t>
+      </w:r>
+    </w:p>
+    <w:p>
+      <w:pPr>
+        <w:pStyle w:val="BodyText"/>
+      </w:pPr>
+      <w:r>
+        <w:rPr>
+          <w:lang w:val="en-US"/>
+        </w:rPr>
+        <w:t xml:space="preserve">“Dear Pig, are you willing to sell for one shilling</w:t>
+      </w:r>
+      <w:r>
+        <w:br/>
+      </w:r>
+      <w:r>
+        <w:rPr>
+          <w:lang w:val="en-US"/>
+        </w:rPr>
+        <w:t xml:space="preserve">Your ring?” Said the Piggy, “I will.”</w:t>
+      </w:r>
+      <w:r>
+        <w:br/>
+      </w:r>
+      <w:r>
+        <w:rPr>
+          <w:lang w:val="en-US"/>
+        </w:rPr>
+        <w:t xml:space="preserve">So they took it away, and were married next day</w:t>
+      </w:r>
+      <w:r>
+        <w:br/>
+      </w:r>
+      <w:r>
+        <w:rPr>
+          <w:lang w:val="en-US"/>
+        </w:rPr>
+        <w:t xml:space="preserve">By the Turkey who lives on the hill.</w:t>
+      </w:r>
+      <w:r>
+        <w:br/>
+      </w:r>
+      <w:r>
+        <w:rPr>
+          <w:lang w:val="en-US"/>
+        </w:rPr>
+        <w:t xml:space="preserve">They dined on mince, and slices of quince,</w:t>
+      </w:r>
+      <w:r>
+        <w:br/>
+      </w:r>
+      <w:r>
+        <w:rPr>
+          <w:lang w:val="en-US"/>
+        </w:rPr>
+        <w:t xml:space="preserve">Which they ate with a runcible spoon;</w:t>
+      </w:r>
+      <w:r>
+        <w:br/>
+      </w:r>
+      <w:r>
+        <w:rPr>
+          <w:lang w:val="en-US"/>
+        </w:rPr>
+        <w:t xml:space="preserve">And hand in hand, on the edge of the sand,</w:t>
+      </w:r>
+      <w:r>
+        <w:br/>
+      </w:r>
+      <w:r>
+        <w:rPr>
+          <w:lang w:val="en-US"/>
+        </w:rPr>
+        <w:t xml:space="preserve">They danced by the light of the moon,</w:t>
+      </w:r>
+      <w:r>
+        <w:br/>
+      </w:r>
+      <w:r>
+        <w:rPr>
+          <w:lang w:val="en-US"/>
+        </w:rPr>
+        <w:t xml:space="preserve">The moon,</w:t>
+      </w:r>
+      <w:r>
+        <w:br/>
+      </w:r>
+      <w:r>
+        <w:rPr>
+          <w:lang w:val="en-US"/>
+        </w:rPr>
+        <w:t xml:space="preserve">The moon,</w:t>
+      </w:r>
+      <w:r>
+        <w:br/>
+      </w:r>
+      <w:r>
+        <w:rPr>
+          <w:lang w:val="en-US"/>
+        </w:rPr>
+        <w:t xml:space="preserve">They danced by the light of the moon.</w:t>
+      </w:r>
+    </w:p>
+    <w:bookmarkEnd w:id="230"/>
+    <w:bookmarkStart w:id="234" w:name="the-jumblies"/>
+    <w:p>
+      <w:pPr>
+        <w:pStyle w:val="Heading3"/>
+      </w:pPr>
+      <w:r>
+        <w:rPr>
+          <w:lang w:val="en-US"/>
+        </w:rPr>
+        <w:t xml:space="preserve">The Jumblies</w:t>
+      </w:r>
+    </w:p>
+    <w:p>
+      <w:pPr>
+        <w:pStyle w:val="FirstParagraph"/>
+      </w:pPr>
+      <w:r>
+        <w:drawing>
+          <wp:inline>
+            <wp:extent cx="2743200" cy="4114799"/>
+            <wp:effectExtent b="0" l="0" r="0" t="0"/>
+            <wp:docPr descr="The Jumblies set sail in their sieve." title="" id="232" name="Picture"/>
+            <a:graphic>
+              <a:graphicData uri="http://schemas.openxmlformats.org/drawingml/2006/picture">
+                <pic:pic>
+                  <pic:nvPicPr>
+                    <pic:cNvPr descr="images/03_jumblies_at_sea.jpg" id="233" name="Picture"/>
+                    <pic:cNvPicPr>
+                      <a:picLocks noChangeArrowheads="1" noChangeAspect="1"/>
+                    </pic:cNvPicPr>
+                  </pic:nvPicPr>
+                  <pic:blipFill>
+                    <a:blip r:embed="rId231"/>
+                    <a:stretch>
+                      <a:fillRect/>
+                    </a:stretch>
+                  </pic:blipFill>
+                  <pic:spPr bwMode="auto">
+                    <a:xfrm>
+                      <a:off x="0" y="0"/>
+                      <a:ext cx="2743200" cy="4114799"/>
+                    </a:xfrm>
+                    <a:prstGeom prst="rect">
+                      <a:avLst/>
+                    </a:prstGeom>
+                    <a:noFill/>
+                    <a:ln w="9525">
+                      <a:noFill/>
+                      <a:headEnd/>
+                      <a:tailEnd/>
+                    </a:ln>
+                  </pic:spPr>
+                </pic:pic>
+              </a:graphicData>
+            </a:graphic>
+          </wp:inline>
+        </w:drawing>
+      </w:r>
+      <w:r>
+        <w:br/>
+      </w:r>
+      <w:r>
+        <w:rPr>
+          <w:i/>
+          <w:iCs/>
+          <w:lang w:val="en-US"/>
+        </w:rPr>
         <w:t xml:space="preserve">An improbable vessel leaves shore.</w:t>
       </w:r>
     </w:p>
@@ -12535,8 +12622,8 @@
         <w:t xml:space="preserve">And they went to sea in a Sieve.</w:t>
       </w:r>
     </w:p>
-    <w:bookmarkEnd w:id="231"/>
-    <w:bookmarkStart w:id="232" w:name="the-pobble-who-has-no-toes"/>
+    <w:bookmarkEnd w:id="234"/>
+    <w:bookmarkStart w:id="235" w:name="the-pobble-who-has-no-toes"/>
     <w:p>
       <w:pPr>
         <w:pStyle w:val="Heading3"/>
@@ -13010,8 +13097,8 @@
         <w:t xml:space="preserve">That Pobbles are happier without their toes.”</w:t>
       </w:r>
     </w:p>
-    <w:bookmarkEnd w:id="232"/>
-    <w:bookmarkStart w:id="233" w:name="the-quangle-wangles-hat"/>
+    <w:bookmarkEnd w:id="235"/>
+    <w:bookmarkStart w:id="236" w:name="the-quangle-wangles-hat"/>
     <w:p>
       <w:pPr>
         <w:pStyle w:val="Heading3"/>
@@ -13539,8 +13626,8 @@
         <w:t xml:space="preserve">With the Quangle Wangle Quee.</w:t>
       </w:r>
     </w:p>
-    <w:bookmarkEnd w:id="233"/>
-    <w:bookmarkStart w:id="234" w:name="jabberwocky"/>
+    <w:bookmarkEnd w:id="236"/>
+    <w:bookmarkStart w:id="237" w:name="jabberwocky"/>
     <w:p>
       <w:pPr>
         <w:pStyle w:val="Heading3"/>
@@ -13818,8 +13905,8 @@
         <w:t xml:space="preserve">And the mome raths outgrabe.</w:t>
       </w:r>
     </w:p>
-    <w:bookmarkEnd w:id="234"/>
-    <w:bookmarkStart w:id="235" w:name="the-crocodile"/>
+    <w:bookmarkEnd w:id="237"/>
+    <w:bookmarkStart w:id="238" w:name="the-crocodile"/>
     <w:p>
       <w:pPr>
         <w:pStyle w:val="Heading3"/>
@@ -13907,9 +13994,9 @@
         <w:t xml:space="preserve">With gently smiling jaws!</w:t>
       </w:r>
     </w:p>
-    <w:bookmarkEnd w:id="235"/>
-    <w:bookmarkEnd w:id="236"/>
-    <w:bookmarkStart w:id="242" w:name="sources-and-text-notes"/>
+    <w:bookmarkEnd w:id="238"/>
+    <w:bookmarkEnd w:id="239"/>
+    <w:bookmarkStart w:id="245" w:name="sources-and-text-notes"/>
     <w:p>
       <w:pPr>
         <w:pStyle w:val="Heading2"/>
@@ -14029,7 +14116,7 @@
           <w:numId w:val="1005"/>
         </w:numPr>
       </w:pPr>
-      <w:hyperlink r:id="rId237">
+      <w:hyperlink r:id="rId240">
         <w:r>
           <w:rPr>
             <w:rStyle w:val="Hyperlink"/>
@@ -14047,7 +14134,7 @@
           <w:numId w:val="1005"/>
         </w:numPr>
       </w:pPr>
-      <w:hyperlink r:id="rId238">
+      <w:hyperlink r:id="rId241">
         <w:r>
           <w:rPr>
             <w:rStyle w:val="Hyperlink"/>
@@ -14065,7 +14152,7 @@
           <w:numId w:val="1005"/>
         </w:numPr>
       </w:pPr>
-      <w:hyperlink r:id="rId239">
+      <w:hyperlink r:id="rId242">
         <w:r>
           <w:rPr>
             <w:rStyle w:val="Hyperlink"/>
@@ -14083,7 +14170,7 @@
           <w:numId w:val="1005"/>
         </w:numPr>
       </w:pPr>
-      <w:hyperlink r:id="rId240">
+      <w:hyperlink r:id="rId243">
         <w:r>
           <w:rPr>
             <w:rStyle w:val="Hyperlink"/>
@@ -14101,7 +14188,7 @@
           <w:numId w:val="1005"/>
         </w:numPr>
       </w:pPr>
-      <w:hyperlink r:id="rId241">
+      <w:hyperlink r:id="rId244">
         <w:r>
           <w:rPr>
             <w:rStyle w:val="Hyperlink"/>
@@ -14122,8 +14209,8 @@
         <w:t xml:space="preserve">The original limericks in “Modern Limericks” were generated with AI and edited by Seamus O’Leary. The illustrations in this edition were generated with AI and selected and placed by Seamus O’Leary. AI-generated material will be disclosed in the KDP publishing form.</w:t>
       </w:r>
     </w:p>
-    <w:bookmarkEnd w:id="242"/>
-    <w:bookmarkStart w:id="243" w:name="about-the-author"/>
+    <w:bookmarkEnd w:id="245"/>
+    <w:bookmarkStart w:id="246" w:name="about-the-author"/>
     <w:p>
       <w:pPr>
         <w:pStyle w:val="Heading2"/>
@@ -14146,8 +14233,8 @@
         <w:t xml:space="preserve">The name Seamus O’Leary is a lighthearted nod to Edward Lear, whose nonsense verse inspired this collection.</w:t>
       </w:r>
     </w:p>
-    <w:bookmarkEnd w:id="243"/>
-    <w:bookmarkStart w:id="244" w:name="back-cover"/>
+    <w:bookmarkEnd w:id="246"/>
+    <w:bookmarkStart w:id="247" w:name="back-cover"/>
     <w:p>
       <w:pPr>
         <w:pStyle w:val="Heading2"/>
@@ -14203,8 +14290,7 @@
         <w:t xml:space="preserve">Seamus O’Leary</w:t>
       </w:r>
     </w:p>
-    <w:bookmarkEnd w:id="244"/>
-    <w:bookmarkEnd w:id="245"/>
+    <w:bookmarkEnd w:id="247"/>
     <w:sectPr>
       <w:pgSz w:h="6912" w:w="5184"/>
       <w:pgMar w:bottom="432" w:footer="720" w:gutter="0" w:header="720" w:left="432" w:right="432" w:top="432"/>

</xml_diff>

<commit_message>
Fix cover page markup
</commit_message>
<xml_diff>
--- a/POETRY/Limericks and Nonsense Rhymes/Limericks_and_Other_Rhymes_for_People_Who_Should_Know_Better_REV02.docx
+++ b/POETRY/Limericks and Nonsense Rhymes/Limericks_and_Other_Rhymes_for_People_Who_Should_Know_Better_REV02.docx
@@ -37,7 +37,7 @@
     </w:p>
     <w:p>
       <w:pPr>
-        <w:pStyle w:val="FirstParagraph"/>
+        <w:pStyle w:val="CaptionedFigure"/>
       </w:pPr>
       <w:r>
         <w:drawing>
@@ -81,62 +81,33 @@
           </wp:inline>
         </w:drawing>
       </w:r>
-      <w:r>
-        <w:rPr>
-          <w:rStyle w:val="VerbatimChar"/>
-          <w:lang w:val="en-US"/>
-        </w:rPr>
-        <w:t xml:space="preserve">r</w:t>
-      </w:r>
-      <w:r>
-        <w:rPr>
-          <w:lang w:val="en-US"/>
-        </w:rPr>
-        <w:t xml:space="preserve">n</w:t>
-      </w:r>
-      <w:r>
-        <w:rPr>
-          <w:rStyle w:val="VerbatimChar"/>
-          <w:lang w:val="en-US"/>
-        </w:rPr>
-        <w:t xml:space="preserve">r</w:t>
-      </w:r>
-      <w:r>
-        <w:rPr>
-          <w:lang w:val="en-US"/>
-        </w:rPr>
-        <w:t xml:space="preserve">n</w:t>
-      </w:r>
-      <w:r>
-        <w:rPr>
-          <w:rStyle w:val="VerbatimChar"/>
-          <w:lang w:val="en-US"/>
-        </w:rPr>
-        <w:t xml:space="preserve">r</w:t>
-      </w:r>
-      <w:r>
-        <w:rPr>
-          <w:lang w:val="en-US"/>
-        </w:rPr>
-        <w:t xml:space="preserve">n</w:t>
-      </w:r>
-      <w:r>
-        <w:rPr>
-          <w:rStyle w:val="VerbatimChar"/>
-          <w:lang w:val="en-US"/>
-        </w:rPr>
-        <w:t xml:space="preserve">r</w:t>
-      </w:r>
-      <w:r>
-        <w:rPr>
-          <w:lang w:val="en-US"/>
-        </w:rPr>
-        <w:t xml:space="preserve">n# Limericks and Other Rhymes for People Who Should Know Better (Illustrated)</w:t>
-      </w:r>
-    </w:p>
-    <w:p>
-      <w:pPr>
-        <w:pStyle w:val="BodyText"/>
+    </w:p>
+    <w:p>
+      <w:pPr>
+        <w:pStyle w:val="ImageCaption"/>
+      </w:pPr>
+      <w:r>
+        <w:rPr>
+          <w:lang w:val="en-US"/>
+        </w:rPr>
+        <w:t xml:space="preserve">Cover: Limericks and Other Rhymes for People Who Should Know Better</w:t>
+      </w:r>
+    </w:p>
+    <w:bookmarkStart w:id="248" w:name="X00693da8d63ee7683df0f17f241e16a3eb08d21"/>
+    <w:p>
+      <w:pPr>
+        <w:pStyle w:val="Heading1"/>
+      </w:pPr>
+      <w:r>
+        <w:rPr>
+          <w:lang w:val="en-US"/>
+        </w:rPr>
+        <w:t xml:space="preserve">Limericks and Other Rhymes for People Who Should Know Better (Illustrated)</w:t>
+      </w:r>
+    </w:p>
+    <w:p>
+      <w:pPr>
+        <w:pStyle w:val="FirstParagraph"/>
       </w:pPr>
       <w:r>
         <w:rPr>
@@ -14291,6 +14262,7 @@
       </w:r>
     </w:p>
     <w:bookmarkEnd w:id="247"/>
+    <w:bookmarkEnd w:id="248"/>
     <w:sectPr>
       <w:pgSz w:h="6912" w:w="5184"/>
       <w:pgMar w:bottom="432" w:footer="720" w:gutter="0" w:header="720" w:left="432" w:right="432" w:top="432"/>

</xml_diff>

<commit_message>
Put cover before the title page
</commit_message>
<xml_diff>
--- a/POETRY/Limericks and Nonsense Rhymes/Limericks_and_Other_Rhymes_for_People_Who_Should_Know_Better_REV02.docx
+++ b/POETRY/Limericks and Nonsense Rhymes/Limericks_and_Other_Rhymes_for_People_Who_Should_Know_Better_REV02.docx
@@ -4,45 +4,12 @@
   <w:body>
     <w:p>
       <w:pPr>
-        <w:pStyle w:val="Title"/>
-      </w:pPr>
-      <w:r>
-        <w:rPr>
-          <w:lang w:val="en-US"/>
-        </w:rPr>
-        <w:t xml:space="preserve">Limericks and Other Rhymes for People Who Should Know Better (Illustrated)</w:t>
-      </w:r>
-    </w:p>
-    <w:p>
-      <w:pPr>
-        <w:pStyle w:val="Subtitle"/>
-      </w:pPr>
-      <w:r>
-        <w:rPr>
-          <w:lang w:val="en-US"/>
-        </w:rPr>
-        <w:t xml:space="preserve">Classic nonsense verse and modern limericks</w:t>
-      </w:r>
-    </w:p>
-    <w:p>
-      <w:pPr>
-        <w:pStyle w:val="Author"/>
-      </w:pPr>
-      <w:r>
-        <w:rPr>
-          <w:lang w:val="en-US"/>
-        </w:rPr>
-        <w:t xml:space="preserve">Seamus O'Leary</w:t>
-      </w:r>
-    </w:p>
-    <w:p>
-      <w:pPr>
         <w:pStyle w:val="CaptionedFigure"/>
       </w:pPr>
       <w:r>
         <w:drawing>
           <wp:inline>
-            <wp:extent cx="2560320" cy="4093414"/>
+            <wp:extent cx="2423160" cy="3874124"/>
             <wp:effectExtent b="0" l="0" r="0" t="0"/>
             <wp:docPr descr="Cover: Limericks and Other Rhymes for People Who Should Know Better" title="" id="10" name="Picture"/>
             <a:graphic>
@@ -63,7 +30,7 @@
                   <pic:spPr bwMode="auto">
                     <a:xfrm>
                       <a:off x="0" y="0"/>
-                      <a:ext cx="2560320" cy="4093414"/>
+                      <a:ext cx="2423160" cy="3874124"/>
                     </a:xfrm>
                     <a:prstGeom prst="rect">
                       <a:avLst/>
@@ -91,6 +58,40 @@
           <w:lang w:val="en-US"/>
         </w:rPr>
         <w:t xml:space="preserve">Cover: Limericks and Other Rhymes for People Who Should Know Better</w:t>
+      </w:r>
+    </w:p>
+    <w:p>
+      <w:pPr>
+        <w:pStyle w:val="Title"/>
+        <w:pageBreakBefore/>
+      </w:pPr>
+      <w:r>
+        <w:rPr>
+          <w:lang w:val="en-US"/>
+        </w:rPr>
+        <w:t xml:space="preserve">Limericks and Other Rhymes for People Who Should Know Better (Illustrated)</w:t>
+      </w:r>
+    </w:p>
+    <w:p>
+      <w:pPr>
+        <w:pStyle w:val="Subtitle"/>
+      </w:pPr>
+      <w:r>
+        <w:rPr>
+          <w:lang w:val="en-US"/>
+        </w:rPr>
+        <w:t xml:space="preserve">Classic nonsense verse and modern limericks</w:t>
+      </w:r>
+    </w:p>
+    <w:p>
+      <w:pPr>
+        <w:pStyle w:val="Author"/>
+      </w:pPr>
+      <w:r>
+        <w:rPr>
+          <w:lang w:val="en-US"/>
+        </w:rPr>
+        <w:t xml:space="preserve">Seamus O'Leary</w:t>
       </w:r>
     </w:p>
     <w:bookmarkStart w:id="248" w:name="X00693da8d63ee7683df0f17f241e16a3eb08d21"/>

</xml_diff>

<commit_message>
Expand Seamus O'Leary author story
</commit_message>
<xml_diff>
--- a/POETRY/Limericks and Nonsense Rhymes/Limericks_and_Other_Rhymes_for_People_Who_Should_Know_Better_REV02.docx
+++ b/POETRY/Limericks and Nonsense Rhymes/Limericks_and_Other_Rhymes_for_People_Who_Should_Know_Better_REV02.docx
@@ -14202,7 +14202,51 @@
         <w:rPr>
           <w:lang w:val="en-US"/>
         </w:rPr>
-        <w:t xml:space="preserve">The name Seamus O’Leary is a lighthearted nod to Edward Lear, whose nonsense verse inspired this collection.</w:t>
+        <w:t xml:space="preserve">Reliable information about Seamus O’Leary is difficult to obtain, largely because his official records are kept by a committee of seven umbrellas, and the umbrellas disagree about everything except Tuesdays. One claims he was born in a cupboard full of maps; another insists he arrived by parcel, addressed to “The Man Who Was Expected Last Thursday.” The third refuses to discuss the matter until someone brings it a small, dry cloud.</w:t>
+      </w:r>
+    </w:p>
+    <w:p>
+      <w:pPr>
+        <w:pStyle w:val="BodyText"/>
+      </w:pPr>
+      <w:r>
+        <w:rPr>
+          <w:lang w:val="en-US"/>
+        </w:rPr>
+        <w:t xml:space="preserve">As a young fellow, Seamus tried to become a lighthouse keeper, although he had no lighthouse and was afraid of the sea whenever it looked back. He therefore installed a lamp on a very tall hat and took up residence on a hill. Ships began steering toward him, which was inconvenient, as he was usually on the other side of the hill looking for his hat. A passing goat was appointed deputy keeper, but resigned after mistaking the moon for a large white turnip and attempting to tow it home in a wheelbarrow.</w:t>
+      </w:r>
+    </w:p>
+    <w:p>
+      <w:pPr>
+        <w:pStyle w:val="BodyText"/>
+      </w:pPr>
+      <w:r>
+        <w:rPr>
+          <w:lang w:val="en-US"/>
+        </w:rPr>
+        <w:t xml:space="preserve">Seamus next opened a school for unusually thoughtful spoons. The spoons learned arithmetic, astronomy, and how to stir tea without waking the cup. Their best pupil, a teaspoon called Admiral, discovered a new continent behind the pantry door. Unfortunately, the continent moved whenever anyone tried to put it on a map, so it was eventually made Professor of Geography and allowed to remain where it pleased.</w:t>
+      </w:r>
+    </w:p>
+    <w:p>
+      <w:pPr>
+        <w:pStyle w:val="BodyText"/>
+      </w:pPr>
+      <w:r>
+        <w:rPr>
+          <w:lang w:val="en-US"/>
+        </w:rPr>
+        <w:t xml:space="preserve">In the evenings, Seamus writes down the reports brought to him by the cat, the goat, the umbrellas, and a very small moon that rents a room in his boot. He tries to make each report rhyme, though the moon is difficult to manage and the goat will only speak in footnotes. The name Seamus O’Leary is a lighthearted nod to Edward Lear, whose nonsense verse showed how respectably an absurdity may wear a hat while boarding a boat that has no business on land.</w:t>
+      </w:r>
+    </w:p>
+    <w:p>
+      <w:pPr>
+        <w:pStyle w:val="BodyText"/>
+      </w:pPr>
+      <w:r>
+        <w:rPr>
+          <w:lang w:val="en-US"/>
+        </w:rPr>
+        <w:t xml:space="preserve">Seamus is currently searching for the seventh umbrella. It has gone to sea with the map, the wheelbarrow, and a letter addressed to next Tuesday. If it returns, the committee promises to issue a statement. The statement will be brief, unless the spoons have learned shorthand.</w:t>
       </w:r>
     </w:p>
     <w:bookmarkEnd w:id="246"/>

</xml_diff>